<commit_message>
feat: improve application document hierarchy and readability
</commit_message>
<xml_diff>
--- a/assets/templates/freeform-application.docx
+++ b/assets/templates/freeform-application.docx
@@ -5,57 +5,120 @@
     <w:p>
       <w:pPr>
         <w:pStyle w:val="Title"/>
-        <w:spacing w:before="0" w:after="160"/>
+        <w:spacing w:before="0" w:after="80" w:line="260" w:lineRule="auto"/>
       </w:pPr>
+      <w:bookmarkStart w:id="500" w:name="findar_resume_title"/>
+      <w:r>
+        <w:rPr>
+          <w:sz w:val="22"/>
+          <w:color w:val="000000"/>
+          <w:b w:val="1"/>
+        </w:rPr>
+        <w:t>입사지원서</w:t>
+      </w:r>
+      <w:bookmarkEnd w:id="500"/>
+    </w:p>
+    <w:p>
+      <w:pPr>
+        <w:spacing w:before="0" w:after="60" w:line="280" w:lineRule="auto"/>
+        <w:keepNext/>
+      </w:pPr>
+      <w:bookmarkStart w:id="600" w:name="findar_resume_company"/>
+      <w:r>
+        <w:rPr>
+          <w:sz w:val="44"/>
+          <w:color w:val="000000"/>
+          <w:b w:val="1"/>
+        </w:rPr>
+        <w:t>[지원 회사]</w:t>
+      </w:r>
+      <w:bookmarkEnd w:id="600"/>
+    </w:p>
+    <w:p>
+      <w:pPr>
+        <w:spacing w:before="0" w:after="100" w:line="280" w:lineRule="auto"/>
+        <w:keepNext/>
+      </w:pPr>
+      <w:bookmarkStart w:id="601" w:name="findar_resume_role"/>
+      <w:r>
+        <w:rPr>
+          <w:sz w:val="20"/>
+          <w:color w:val="000000"/>
+          <w:b w:val="0"/>
+        </w:rPr>
+        <w:t xml:space="preserve">지원 팀 및 직무  </w:t>
+      </w:r>
+      <w:r>
+        <w:rPr>
+          <w:sz w:val="28"/>
+          <w:color w:val="000000"/>
+          <w:b w:val="1"/>
+        </w:rPr>
+        <w:t>[지원 팀 또는 직무]</w:t>
+      </w:r>
+      <w:bookmarkEnd w:id="601"/>
+    </w:p>
+    <w:p>
+      <w:pPr>
+        <w:spacing w:before="0" w:after="40" w:line="260" w:lineRule="auto"/>
+      </w:pPr>
+      <w:bookmarkStart w:id="501" w:name="findar_resume_name"/>
+      <w:r>
+        <w:rPr>
+          <w:sz w:val="20"/>
+          <w:color w:val="000000"/>
+          <w:b w:val="0"/>
+        </w:rPr>
+        <w:t xml:space="preserve">지원자  </w:t>
+      </w:r>
+      <w:r>
+        <w:rPr>
+          <w:sz w:val="30"/>
+          <w:color w:val="000000"/>
+          <w:b w:val="1"/>
+        </w:rPr>
+        <w:t>[성명]</w:t>
+      </w:r>
+      <w:bookmarkEnd w:id="501"/>
+    </w:p>
+    <w:p>
+      <w:pPr>
+        <w:spacing w:before="0" w:after="60" w:line="260" w:lineRule="auto"/>
+      </w:pPr>
+      <w:bookmarkStart w:id="502" w:name="findar_resume_contact"/>
       <w:r>
         <w:rPr>
           <w:b w:val="0"/>
+          <w:sz w:val="21"/>
         </w:rPr>
-        <w:t>입사지원서</w:t>
+        <w:t>[연락처]  |  [이메일]</w:t>
       </w:r>
+      <w:bookmarkEnd w:id="502"/>
     </w:p>
     <w:p>
       <w:pPr>
-        <w:spacing w:before="0" w:after="100"/>
+        <w:spacing w:before="0" w:after="60" w:line="260" w:lineRule="auto"/>
       </w:pPr>
-      <w:r>
-        <w:rPr>
-          <w:b/>
-          <w:sz w:val="38"/>
-        </w:rPr>
-        <w:t>[성명]</w:t>
-      </w:r>
-    </w:p>
-    <w:p>
-      <w:pPr>
-        <w:spacing w:before="0" w:after="80"/>
-      </w:pPr>
-      <w:r>
-        <w:rPr>
-          <w:b w:val="0"/>
-        </w:rPr>
-        <w:t>[연락처]  |  [이메일]</w:t>
-      </w:r>
-    </w:p>
-    <w:p>
-      <w:pPr>
-        <w:spacing w:before="0" w:after="20"/>
-      </w:pPr>
+      <w:bookmarkStart w:id="503" w:name="findar_resume_extra"/>
       <w:r>
         <w:rPr>
           <w:b w:val="0"/>
           <w:color w:val="595959"/>
+          <w:sz w:val="21"/>
         </w:rPr>
         <w:t>[거주 지역 또는 포트폴리오 주소 등 필요한 연락 정보]</w:t>
       </w:r>
+      <w:bookmarkEnd w:id="503"/>
     </w:p>
     <w:p>
       <w:pPr>
         <w:pStyle w:val="Heading1"/>
       </w:pPr>
+      <w:bookmarkStart w:id="504" w:name="findar_education_heading"/>
       <w:r>
         <w:t>학력</w:t>
       </w:r>
+      <w:bookmarkEnd w:id="504"/>
     </w:p>
     <w:tbl>
       <w:tblPr>
@@ -71,6 +134,7 @@
           <w:insideH w:val="single" w:sz="4" w:color="D9D9D9"/>
           <w:insideV w:val="single" w:sz="4" w:color="D9D9D9"/>
         </w:tblBorders>
+        <w:tblCaption w:val="findar_education_table"/>
       </w:tblPr>
       <w:tblGrid>
         <w:gridCol w:w="1944"/>
@@ -88,8 +152,8 @@
             <w:tcW w:type="dxa" w:w="1944"/>
             <w:vAlign w:val="center"/>
             <w:tcMar>
-              <w:top w:w="100" w:type="dxa"/>
-              <w:bottom w:w="100" w:type="dxa"/>
+              <w:top w:w="85" w:type="dxa"/>
+              <w:bottom w:w="85" w:type="dxa"/>
               <w:left w:w="110" w:type="dxa"/>
               <w:right w:w="110" w:type="dxa"/>
             </w:tcMar>
@@ -97,8 +161,9 @@
           </w:tcPr>
           <w:p>
             <w:pPr>
-              <w:spacing w:after="0" w:line="276" w:lineRule="auto"/>
+              <w:spacing w:after="0" w:line="280" w:lineRule="auto" w:before="0"/>
               <w:jc w:val="center"/>
+              <w:snapToGrid w:val="0"/>
             </w:pPr>
             <w:r>
               <w:rPr>
@@ -115,8 +180,8 @@
             <w:tcW w:type="dxa" w:w="3528"/>
             <w:vAlign w:val="center"/>
             <w:tcMar>
-              <w:top w:w="100" w:type="dxa"/>
-              <w:bottom w:w="100" w:type="dxa"/>
+              <w:top w:w="85" w:type="dxa"/>
+              <w:bottom w:w="85" w:type="dxa"/>
               <w:left w:w="110" w:type="dxa"/>
               <w:right w:w="110" w:type="dxa"/>
             </w:tcMar>
@@ -124,8 +189,9 @@
           </w:tcPr>
           <w:p>
             <w:pPr>
-              <w:spacing w:after="0" w:line="276" w:lineRule="auto"/>
+              <w:spacing w:after="0" w:line="280" w:lineRule="auto" w:before="0"/>
               <w:jc w:val="center"/>
+              <w:snapToGrid w:val="0"/>
             </w:pPr>
             <w:r>
               <w:rPr>
@@ -142,8 +208,8 @@
             <w:tcW w:type="dxa" w:w="2088"/>
             <w:vAlign w:val="center"/>
             <w:tcMar>
-              <w:top w:w="100" w:type="dxa"/>
-              <w:bottom w:w="100" w:type="dxa"/>
+              <w:top w:w="85" w:type="dxa"/>
+              <w:bottom w:w="85" w:type="dxa"/>
               <w:left w:w="110" w:type="dxa"/>
               <w:right w:w="110" w:type="dxa"/>
             </w:tcMar>
@@ -151,8 +217,9 @@
           </w:tcPr>
           <w:p>
             <w:pPr>
-              <w:spacing w:after="0" w:line="276" w:lineRule="auto"/>
+              <w:spacing w:after="0" w:line="280" w:lineRule="auto" w:before="0"/>
               <w:jc w:val="center"/>
+              <w:snapToGrid w:val="0"/>
             </w:pPr>
             <w:r>
               <w:rPr>
@@ -169,8 +236,8 @@
             <w:tcW w:type="dxa" w:w="2606"/>
             <w:vAlign w:val="center"/>
             <w:tcMar>
-              <w:top w:w="100" w:type="dxa"/>
-              <w:bottom w:w="100" w:type="dxa"/>
+              <w:top w:w="85" w:type="dxa"/>
+              <w:bottom w:w="85" w:type="dxa"/>
               <w:left w:w="110" w:type="dxa"/>
               <w:right w:w="110" w:type="dxa"/>
             </w:tcMar>
@@ -178,8 +245,9 @@
           </w:tcPr>
           <w:p>
             <w:pPr>
-              <w:spacing w:after="0" w:line="276" w:lineRule="auto"/>
+              <w:spacing w:after="0" w:line="280" w:lineRule="auto" w:before="0"/>
               <w:jc w:val="center"/>
+              <w:snapToGrid w:val="0"/>
             </w:pPr>
             <w:r>
               <w:rPr>
@@ -201,26 +269,27 @@
             <w:tcW w:type="dxa" w:w="1944"/>
             <w:vAlign w:val="center"/>
             <w:tcMar>
-              <w:top w:w="100" w:type="dxa"/>
-              <w:bottom w:w="100" w:type="dxa"/>
+              <w:top w:w="85" w:type="dxa"/>
+              <w:bottom w:w="85" w:type="dxa"/>
               <w:left w:w="110" w:type="dxa"/>
               <w:right w:w="110" w:type="dxa"/>
             </w:tcMar>
           </w:tcPr>
           <w:p>
             <w:pPr>
-              <w:spacing w:after="0" w:line="276" w:lineRule="auto"/>
+              <w:spacing w:after="0" w:line="280" w:lineRule="auto" w:before="0"/>
               <w:jc w:val="center"/>
+              <w:snapToGrid w:val="0"/>
             </w:pPr>
             <w:r>
               <w:rPr>
+                <w:sz w:val="21"/>
+                <w:color w:val="000000"/>
                 <w:b w:val="0"/>
-                <w:color w:val="595959"/>
-                <w:sz w:val="20"/>
               </w:rPr>
-              <w:t>[YYYY.MM -</w:t>
+              <w:t>[시작일]</w:t>
               <w:br/>
-              <w:t>YYYY.MM]</w:t>
+              <w:t>- [졸업일]</w:t>
             </w:r>
           </w:p>
         </w:tc>
@@ -229,21 +298,22 @@
             <w:tcW w:type="dxa" w:w="3528"/>
             <w:vAlign w:val="center"/>
             <w:tcMar>
-              <w:top w:w="100" w:type="dxa"/>
-              <w:bottom w:w="100" w:type="dxa"/>
+              <w:top w:w="85" w:type="dxa"/>
+              <w:bottom w:w="85" w:type="dxa"/>
               <w:left w:w="110" w:type="dxa"/>
               <w:right w:w="110" w:type="dxa"/>
             </w:tcMar>
           </w:tcPr>
           <w:p>
             <w:pPr>
-              <w:spacing w:after="0" w:line="276" w:lineRule="auto"/>
+              <w:spacing w:after="0" w:line="280" w:lineRule="auto" w:before="0"/>
+              <w:snapToGrid w:val="0"/>
             </w:pPr>
             <w:r>
               <w:rPr>
                 <w:b w:val="0"/>
                 <w:color w:val="595959"/>
-                <w:sz w:val="20"/>
+                <w:sz w:val="21"/>
               </w:rPr>
               <w:t>[학교명]</w:t>
               <w:br/>
@@ -256,21 +326,22 @@
             <w:tcW w:type="dxa" w:w="2088"/>
             <w:vAlign w:val="center"/>
             <w:tcMar>
-              <w:top w:w="100" w:type="dxa"/>
-              <w:bottom w:w="100" w:type="dxa"/>
+              <w:top w:w="85" w:type="dxa"/>
+              <w:bottom w:w="85" w:type="dxa"/>
               <w:left w:w="110" w:type="dxa"/>
               <w:right w:w="110" w:type="dxa"/>
             </w:tcMar>
           </w:tcPr>
           <w:p>
             <w:pPr>
-              <w:spacing w:after="0" w:line="276" w:lineRule="auto"/>
+              <w:spacing w:after="0" w:line="280" w:lineRule="auto" w:before="0"/>
+              <w:snapToGrid w:val="0"/>
             </w:pPr>
             <w:r>
               <w:rPr>
                 <w:b w:val="0"/>
                 <w:color w:val="595959"/>
-                <w:sz w:val="20"/>
+                <w:sz w:val="21"/>
               </w:rPr>
               <w:t>[학위]</w:t>
               <w:br/>
@@ -283,21 +354,22 @@
             <w:tcW w:type="dxa" w:w="2606"/>
             <w:vAlign w:val="center"/>
             <w:tcMar>
-              <w:top w:w="100" w:type="dxa"/>
-              <w:bottom w:w="100" w:type="dxa"/>
+              <w:top w:w="85" w:type="dxa"/>
+              <w:bottom w:w="85" w:type="dxa"/>
               <w:left w:w="110" w:type="dxa"/>
               <w:right w:w="110" w:type="dxa"/>
             </w:tcMar>
           </w:tcPr>
           <w:p>
             <w:pPr>
-              <w:spacing w:after="0" w:line="276" w:lineRule="auto"/>
+              <w:spacing w:after="0" w:line="280" w:lineRule="auto" w:before="0"/>
+              <w:snapToGrid w:val="0"/>
             </w:pPr>
             <w:r>
               <w:rPr>
                 <w:b w:val="0"/>
                 <w:color w:val="595959"/>
-                <w:sz w:val="20"/>
+                <w:sz w:val="21"/>
               </w:rPr>
               <w:t>[취득 / 만점]</w:t>
             </w:r>
@@ -309,9 +381,11 @@
       <w:pPr>
         <w:pStyle w:val="Heading1"/>
       </w:pPr>
+      <w:bookmarkStart w:id="506" w:name="findar_work_heading"/>
       <w:r>
         <w:t>경력</w:t>
       </w:r>
+      <w:bookmarkEnd w:id="506"/>
     </w:p>
     <w:tbl>
       <w:tblPr>
@@ -327,6 +401,7 @@
           <w:insideH w:val="single" w:sz="4" w:color="D9D9D9"/>
           <w:insideV w:val="single" w:sz="4" w:color="D9D9D9"/>
         </w:tblBorders>
+        <w:tblCaption w:val="findar_work_table"/>
       </w:tblPr>
       <w:tblGrid>
         <w:gridCol w:w="2232"/>
@@ -343,8 +418,8 @@
             <w:tcW w:type="dxa" w:w="2232"/>
             <w:vAlign w:val="center"/>
             <w:tcMar>
-              <w:top w:w="100" w:type="dxa"/>
-              <w:bottom w:w="100" w:type="dxa"/>
+              <w:top w:w="85" w:type="dxa"/>
+              <w:bottom w:w="85" w:type="dxa"/>
               <w:left w:w="110" w:type="dxa"/>
               <w:right w:w="110" w:type="dxa"/>
             </w:tcMar>
@@ -352,8 +427,9 @@
           </w:tcPr>
           <w:p>
             <w:pPr>
-              <w:spacing w:after="0" w:line="276" w:lineRule="auto"/>
+              <w:spacing w:after="0" w:line="280" w:lineRule="auto" w:before="0"/>
               <w:jc w:val="center"/>
+              <w:snapToGrid w:val="0"/>
             </w:pPr>
             <w:r>
               <w:rPr>
@@ -370,8 +446,8 @@
             <w:tcW w:type="dxa" w:w="5126"/>
             <w:vAlign w:val="center"/>
             <w:tcMar>
-              <w:top w:w="100" w:type="dxa"/>
-              <w:bottom w:w="100" w:type="dxa"/>
+              <w:top w:w="85" w:type="dxa"/>
+              <w:bottom w:w="85" w:type="dxa"/>
               <w:left w:w="110" w:type="dxa"/>
               <w:right w:w="110" w:type="dxa"/>
             </w:tcMar>
@@ -379,8 +455,9 @@
           </w:tcPr>
           <w:p>
             <w:pPr>
-              <w:spacing w:after="0" w:line="276" w:lineRule="auto"/>
+              <w:spacing w:after="0" w:line="280" w:lineRule="auto" w:before="0"/>
               <w:jc w:val="center"/>
+              <w:snapToGrid w:val="0"/>
             </w:pPr>
             <w:r>
               <w:rPr>
@@ -397,8 +474,8 @@
             <w:tcW w:type="dxa" w:w="2808"/>
             <w:vAlign w:val="center"/>
             <w:tcMar>
-              <w:top w:w="100" w:type="dxa"/>
-              <w:bottom w:w="100" w:type="dxa"/>
+              <w:top w:w="85" w:type="dxa"/>
+              <w:bottom w:w="85" w:type="dxa"/>
               <w:left w:w="110" w:type="dxa"/>
               <w:right w:w="110" w:type="dxa"/>
             </w:tcMar>
@@ -406,8 +483,9 @@
           </w:tcPr>
           <w:p>
             <w:pPr>
-              <w:spacing w:after="0" w:line="276" w:lineRule="auto"/>
+              <w:spacing w:after="0" w:line="280" w:lineRule="auto" w:before="0"/>
               <w:jc w:val="center"/>
+              <w:snapToGrid w:val="0"/>
             </w:pPr>
             <w:r>
               <w:rPr>
@@ -429,25 +507,26 @@
             <w:tcW w:type="dxa" w:w="2232"/>
             <w:vAlign w:val="center"/>
             <w:tcMar>
-              <w:top w:w="100" w:type="dxa"/>
-              <w:bottom w:w="100" w:type="dxa"/>
+              <w:top w:w="85" w:type="dxa"/>
+              <w:bottom w:w="85" w:type="dxa"/>
               <w:left w:w="110" w:type="dxa"/>
               <w:right w:w="110" w:type="dxa"/>
             </w:tcMar>
           </w:tcPr>
           <w:p>
             <w:pPr>
-              <w:spacing w:after="0" w:line="276" w:lineRule="auto"/>
+              <w:spacing w:after="0" w:line="280" w:lineRule="auto" w:before="0"/>
+              <w:snapToGrid w:val="0"/>
             </w:pPr>
             <w:r>
               <w:rPr>
+                <w:sz w:val="21"/>
+                <w:color w:val="000000"/>
                 <w:b w:val="0"/>
-                <w:color w:val="595959"/>
-                <w:sz w:val="20"/>
               </w:rPr>
-              <w:t>[YYYY.MM -</w:t>
+              <w:t>[시작일]</w:t>
               <w:br/>
-              <w:t>YYYY.MM 또는 현재]</w:t>
+              <w:t>- [종료일 또는 현재]</w:t>
             </w:r>
           </w:p>
         </w:tc>
@@ -456,21 +535,22 @@
             <w:tcW w:type="dxa" w:w="5126"/>
             <w:vAlign w:val="center"/>
             <w:tcMar>
-              <w:top w:w="100" w:type="dxa"/>
-              <w:bottom w:w="100" w:type="dxa"/>
+              <w:top w:w="85" w:type="dxa"/>
+              <w:bottom w:w="85" w:type="dxa"/>
               <w:left w:w="110" w:type="dxa"/>
               <w:right w:w="110" w:type="dxa"/>
             </w:tcMar>
           </w:tcPr>
           <w:p>
             <w:pPr>
-              <w:spacing w:after="0" w:line="276" w:lineRule="auto"/>
+              <w:spacing w:after="0" w:line="280" w:lineRule="auto" w:before="0"/>
+              <w:snapToGrid w:val="0"/>
             </w:pPr>
             <w:r>
               <w:rPr>
                 <w:b w:val="0"/>
                 <w:color w:val="595959"/>
-                <w:sz w:val="20"/>
+                <w:sz w:val="21"/>
               </w:rPr>
               <w:t>[회사명 / 부서명]</w:t>
               <w:br/>
@@ -483,21 +563,22 @@
             <w:tcW w:type="dxa" w:w="2808"/>
             <w:vAlign w:val="center"/>
             <w:tcMar>
-              <w:top w:w="100" w:type="dxa"/>
-              <w:bottom w:w="100" w:type="dxa"/>
+              <w:top w:w="85" w:type="dxa"/>
+              <w:bottom w:w="85" w:type="dxa"/>
               <w:left w:w="110" w:type="dxa"/>
               <w:right w:w="110" w:type="dxa"/>
             </w:tcMar>
           </w:tcPr>
           <w:p>
             <w:pPr>
-              <w:spacing w:after="0" w:line="276" w:lineRule="auto"/>
+              <w:spacing w:after="0" w:line="280" w:lineRule="auto" w:before="0"/>
+              <w:snapToGrid w:val="0"/>
             </w:pPr>
             <w:r>
               <w:rPr>
                 <w:b w:val="0"/>
                 <w:color w:val="595959"/>
-                <w:sz w:val="20"/>
+                <w:sz w:val="21"/>
               </w:rPr>
               <w:t>[직위]</w:t>
               <w:br/>
@@ -511,9 +592,11 @@
       <w:pPr>
         <w:pStyle w:val="Heading1"/>
       </w:pPr>
+      <w:bookmarkStart w:id="508" w:name="findar_credentials_heading"/>
       <w:r>
         <w:t>자격 및 어학</w:t>
       </w:r>
+      <w:bookmarkEnd w:id="508"/>
     </w:p>
     <w:tbl>
       <w:tblPr>
@@ -529,6 +612,7 @@
           <w:insideH w:val="single" w:sz="4" w:color="D9D9D9"/>
           <w:insideV w:val="single" w:sz="4" w:color="D9D9D9"/>
         </w:tblBorders>
+        <w:tblCaption w:val="findar_credentials_table"/>
       </w:tblPr>
       <w:tblGrid>
         <w:gridCol w:w="893"/>
@@ -547,8 +631,8 @@
             <w:tcW w:type="dxa" w:w="893"/>
             <w:vAlign w:val="center"/>
             <w:tcMar>
-              <w:top w:w="100" w:type="dxa"/>
-              <w:bottom w:w="100" w:type="dxa"/>
+              <w:top w:w="85" w:type="dxa"/>
+              <w:bottom w:w="85" w:type="dxa"/>
               <w:left w:w="110" w:type="dxa"/>
               <w:right w:w="110" w:type="dxa"/>
             </w:tcMar>
@@ -556,8 +640,9 @@
           </w:tcPr>
           <w:p>
             <w:pPr>
-              <w:spacing w:after="0" w:line="276" w:lineRule="auto"/>
+              <w:spacing w:after="0" w:line="280" w:lineRule="auto" w:before="0"/>
               <w:jc w:val="center"/>
+              <w:snapToGrid w:val="0"/>
             </w:pPr>
             <w:r>
               <w:rPr>
@@ -574,8 +659,8 @@
             <w:tcW w:type="dxa" w:w="2952"/>
             <w:vAlign w:val="center"/>
             <w:tcMar>
-              <w:top w:w="100" w:type="dxa"/>
-              <w:bottom w:w="100" w:type="dxa"/>
+              <w:top w:w="85" w:type="dxa"/>
+              <w:bottom w:w="85" w:type="dxa"/>
               <w:left w:w="110" w:type="dxa"/>
               <w:right w:w="110" w:type="dxa"/>
             </w:tcMar>
@@ -583,8 +668,9 @@
           </w:tcPr>
           <w:p>
             <w:pPr>
-              <w:spacing w:after="0" w:line="276" w:lineRule="auto"/>
+              <w:spacing w:after="0" w:line="280" w:lineRule="auto" w:before="0"/>
               <w:jc w:val="center"/>
+              <w:snapToGrid w:val="0"/>
             </w:pPr>
             <w:r>
               <w:rPr>
@@ -601,8 +687,8 @@
             <w:tcW w:type="dxa" w:w="2520"/>
             <w:vAlign w:val="center"/>
             <w:tcMar>
-              <w:top w:w="100" w:type="dxa"/>
-              <w:bottom w:w="100" w:type="dxa"/>
+              <w:top w:w="85" w:type="dxa"/>
+              <w:bottom w:w="85" w:type="dxa"/>
               <w:left w:w="110" w:type="dxa"/>
               <w:right w:w="110" w:type="dxa"/>
             </w:tcMar>
@@ -610,8 +696,9 @@
           </w:tcPr>
           <w:p>
             <w:pPr>
-              <w:spacing w:after="0" w:line="276" w:lineRule="auto"/>
+              <w:spacing w:after="0" w:line="280" w:lineRule="auto" w:before="0"/>
               <w:jc w:val="center"/>
+              <w:snapToGrid w:val="0"/>
             </w:pPr>
             <w:r>
               <w:rPr>
@@ -628,8 +715,8 @@
             <w:tcW w:type="dxa" w:w="1642"/>
             <w:vAlign w:val="center"/>
             <w:tcMar>
-              <w:top w:w="100" w:type="dxa"/>
-              <w:bottom w:w="100" w:type="dxa"/>
+              <w:top w:w="85" w:type="dxa"/>
+              <w:bottom w:w="85" w:type="dxa"/>
               <w:left w:w="110" w:type="dxa"/>
               <w:right w:w="110" w:type="dxa"/>
             </w:tcMar>
@@ -637,8 +724,9 @@
           </w:tcPr>
           <w:p>
             <w:pPr>
-              <w:spacing w:after="0" w:line="276" w:lineRule="auto"/>
+              <w:spacing w:after="0" w:line="280" w:lineRule="auto" w:before="0"/>
               <w:jc w:val="center"/>
+              <w:snapToGrid w:val="0"/>
             </w:pPr>
             <w:r>
               <w:rPr>
@@ -655,8 +743,8 @@
             <w:tcW w:type="dxa" w:w="2160"/>
             <w:vAlign w:val="center"/>
             <w:tcMar>
-              <w:top w:w="100" w:type="dxa"/>
-              <w:bottom w:w="100" w:type="dxa"/>
+              <w:top w:w="85" w:type="dxa"/>
+              <w:bottom w:w="85" w:type="dxa"/>
               <w:left w:w="110" w:type="dxa"/>
               <w:right w:w="110" w:type="dxa"/>
             </w:tcMar>
@@ -664,8 +752,9 @@
           </w:tcPr>
           <w:p>
             <w:pPr>
-              <w:spacing w:after="0" w:line="276" w:lineRule="auto"/>
+              <w:spacing w:after="0" w:line="280" w:lineRule="auto" w:before="0"/>
               <w:jc w:val="center"/>
+              <w:snapToGrid w:val="0"/>
             </w:pPr>
             <w:r>
               <w:rPr>
@@ -687,22 +776,23 @@
             <w:tcW w:type="dxa" w:w="893"/>
             <w:vAlign w:val="center"/>
             <w:tcMar>
-              <w:top w:w="100" w:type="dxa"/>
-              <w:bottom w:w="100" w:type="dxa"/>
+              <w:top w:w="85" w:type="dxa"/>
+              <w:bottom w:w="85" w:type="dxa"/>
               <w:left w:w="110" w:type="dxa"/>
               <w:right w:w="110" w:type="dxa"/>
             </w:tcMar>
           </w:tcPr>
           <w:p>
             <w:pPr>
-              <w:spacing w:after="0" w:line="276" w:lineRule="auto"/>
+              <w:spacing w:after="0" w:line="280" w:lineRule="auto" w:before="0"/>
               <w:jc w:val="center"/>
+              <w:snapToGrid w:val="0"/>
             </w:pPr>
             <w:r>
               <w:rPr>
                 <w:b w:val="0"/>
                 <w:color w:val="595959"/>
-                <w:sz w:val="20"/>
+                <w:sz w:val="21"/>
               </w:rPr>
               <w:t>자격</w:t>
             </w:r>
@@ -713,21 +803,22 @@
             <w:tcW w:type="dxa" w:w="2952"/>
             <w:vAlign w:val="center"/>
             <w:tcMar>
-              <w:top w:w="100" w:type="dxa"/>
-              <w:bottom w:w="100" w:type="dxa"/>
+              <w:top w:w="85" w:type="dxa"/>
+              <w:bottom w:w="85" w:type="dxa"/>
               <w:left w:w="110" w:type="dxa"/>
               <w:right w:w="110" w:type="dxa"/>
             </w:tcMar>
           </w:tcPr>
           <w:p>
             <w:pPr>
-              <w:spacing w:after="0" w:line="276" w:lineRule="auto"/>
+              <w:spacing w:after="0" w:line="280" w:lineRule="auto" w:before="0"/>
+              <w:snapToGrid w:val="0"/>
             </w:pPr>
             <w:r>
               <w:rPr>
                 <w:b w:val="0"/>
                 <w:color w:val="595959"/>
-                <w:sz w:val="20"/>
+                <w:sz w:val="21"/>
               </w:rPr>
               <w:t>[자격명]</w:t>
             </w:r>
@@ -738,21 +829,22 @@
             <w:tcW w:type="dxa" w:w="2520"/>
             <w:vAlign w:val="center"/>
             <w:tcMar>
-              <w:top w:w="100" w:type="dxa"/>
-              <w:bottom w:w="100" w:type="dxa"/>
+              <w:top w:w="85" w:type="dxa"/>
+              <w:bottom w:w="85" w:type="dxa"/>
               <w:left w:w="110" w:type="dxa"/>
               <w:right w:w="110" w:type="dxa"/>
             </w:tcMar>
           </w:tcPr>
           <w:p>
             <w:pPr>
-              <w:spacing w:after="0" w:line="276" w:lineRule="auto"/>
+              <w:spacing w:after="0" w:line="280" w:lineRule="auto" w:before="0"/>
+              <w:snapToGrid w:val="0"/>
             </w:pPr>
             <w:r>
               <w:rPr>
                 <w:b w:val="0"/>
                 <w:color w:val="595959"/>
-                <w:sz w:val="20"/>
+                <w:sz w:val="21"/>
               </w:rPr>
               <w:t>[기관명]</w:t>
             </w:r>
@@ -763,22 +855,23 @@
             <w:tcW w:type="dxa" w:w="1642"/>
             <w:vAlign w:val="center"/>
             <w:tcMar>
-              <w:top w:w="100" w:type="dxa"/>
-              <w:bottom w:w="100" w:type="dxa"/>
+              <w:top w:w="85" w:type="dxa"/>
+              <w:bottom w:w="85" w:type="dxa"/>
               <w:left w:w="110" w:type="dxa"/>
               <w:right w:w="110" w:type="dxa"/>
             </w:tcMar>
           </w:tcPr>
           <w:p>
             <w:pPr>
-              <w:spacing w:after="0" w:line="276" w:lineRule="auto"/>
+              <w:spacing w:after="0" w:line="280" w:lineRule="auto" w:before="0"/>
               <w:jc w:val="center"/>
+              <w:snapToGrid w:val="0"/>
             </w:pPr>
             <w:r>
               <w:rPr>
                 <w:b w:val="0"/>
                 <w:color w:val="595959"/>
-                <w:sz w:val="20"/>
+                <w:sz w:val="21"/>
               </w:rPr>
               <w:t>[YYYY.MM]</w:t>
             </w:r>
@@ -789,21 +882,22 @@
             <w:tcW w:type="dxa" w:w="2160"/>
             <w:vAlign w:val="center"/>
             <w:tcMar>
-              <w:top w:w="100" w:type="dxa"/>
-              <w:bottom w:w="100" w:type="dxa"/>
+              <w:top w:w="85" w:type="dxa"/>
+              <w:bottom w:w="85" w:type="dxa"/>
               <w:left w:w="110" w:type="dxa"/>
               <w:right w:w="110" w:type="dxa"/>
             </w:tcMar>
           </w:tcPr>
           <w:p>
             <w:pPr>
-              <w:spacing w:after="0" w:line="276" w:lineRule="auto"/>
+              <w:spacing w:after="0" w:line="280" w:lineRule="auto" w:before="0"/>
+              <w:snapToGrid w:val="0"/>
             </w:pPr>
             <w:r>
               <w:rPr>
                 <w:b w:val="0"/>
                 <w:color w:val="595959"/>
-                <w:sz w:val="20"/>
+                <w:sz w:val="21"/>
               </w:rPr>
               <w:t>[등급 또는 합격]</w:t>
             </w:r>
@@ -819,22 +913,23 @@
             <w:tcW w:type="dxa" w:w="893"/>
             <w:vAlign w:val="center"/>
             <w:tcMar>
-              <w:top w:w="100" w:type="dxa"/>
-              <w:bottom w:w="100" w:type="dxa"/>
+              <w:top w:w="85" w:type="dxa"/>
+              <w:bottom w:w="85" w:type="dxa"/>
               <w:left w:w="110" w:type="dxa"/>
               <w:right w:w="110" w:type="dxa"/>
             </w:tcMar>
           </w:tcPr>
           <w:p>
             <w:pPr>
-              <w:spacing w:after="0" w:line="276" w:lineRule="auto"/>
+              <w:spacing w:after="0" w:line="280" w:lineRule="auto" w:before="0"/>
               <w:jc w:val="center"/>
+              <w:snapToGrid w:val="0"/>
             </w:pPr>
             <w:r>
               <w:rPr>
                 <w:b w:val="0"/>
                 <w:color w:val="595959"/>
-                <w:sz w:val="20"/>
+                <w:sz w:val="21"/>
               </w:rPr>
               <w:t>어학</w:t>
             </w:r>
@@ -845,21 +940,22 @@
             <w:tcW w:type="dxa" w:w="2952"/>
             <w:vAlign w:val="center"/>
             <w:tcMar>
-              <w:top w:w="100" w:type="dxa"/>
-              <w:bottom w:w="100" w:type="dxa"/>
+              <w:top w:w="85" w:type="dxa"/>
+              <w:bottom w:w="85" w:type="dxa"/>
               <w:left w:w="110" w:type="dxa"/>
               <w:right w:w="110" w:type="dxa"/>
             </w:tcMar>
           </w:tcPr>
           <w:p>
             <w:pPr>
-              <w:spacing w:after="0" w:line="276" w:lineRule="auto"/>
+              <w:spacing w:after="0" w:line="280" w:lineRule="auto" w:before="0"/>
+              <w:snapToGrid w:val="0"/>
             </w:pPr>
             <w:r>
               <w:rPr>
                 <w:b w:val="0"/>
                 <w:color w:val="595959"/>
-                <w:sz w:val="20"/>
+                <w:sz w:val="21"/>
               </w:rPr>
               <w:t>[시험명]</w:t>
             </w:r>
@@ -870,21 +966,22 @@
             <w:tcW w:type="dxa" w:w="2520"/>
             <w:vAlign w:val="center"/>
             <w:tcMar>
-              <w:top w:w="100" w:type="dxa"/>
-              <w:bottom w:w="100" w:type="dxa"/>
+              <w:top w:w="85" w:type="dxa"/>
+              <w:bottom w:w="85" w:type="dxa"/>
               <w:left w:w="110" w:type="dxa"/>
               <w:right w:w="110" w:type="dxa"/>
             </w:tcMar>
           </w:tcPr>
           <w:p>
             <w:pPr>
-              <w:spacing w:after="0" w:line="276" w:lineRule="auto"/>
+              <w:spacing w:after="0" w:line="280" w:lineRule="auto" w:before="0"/>
+              <w:snapToGrid w:val="0"/>
             </w:pPr>
             <w:r>
               <w:rPr>
                 <w:b w:val="0"/>
                 <w:color w:val="595959"/>
-                <w:sz w:val="20"/>
+                <w:sz w:val="21"/>
               </w:rPr>
               <w:t>[기관명]</w:t>
             </w:r>
@@ -895,22 +992,23 @@
             <w:tcW w:type="dxa" w:w="1642"/>
             <w:vAlign w:val="center"/>
             <w:tcMar>
-              <w:top w:w="100" w:type="dxa"/>
-              <w:bottom w:w="100" w:type="dxa"/>
+              <w:top w:w="85" w:type="dxa"/>
+              <w:bottom w:w="85" w:type="dxa"/>
               <w:left w:w="110" w:type="dxa"/>
               <w:right w:w="110" w:type="dxa"/>
             </w:tcMar>
           </w:tcPr>
           <w:p>
             <w:pPr>
-              <w:spacing w:after="0" w:line="276" w:lineRule="auto"/>
+              <w:spacing w:after="0" w:line="280" w:lineRule="auto" w:before="0"/>
               <w:jc w:val="center"/>
+              <w:snapToGrid w:val="0"/>
             </w:pPr>
             <w:r>
               <w:rPr>
                 <w:b w:val="0"/>
                 <w:color w:val="595959"/>
-                <w:sz w:val="20"/>
+                <w:sz w:val="21"/>
               </w:rPr>
               <w:t>[YYYY.MM]</w:t>
             </w:r>
@@ -921,21 +1019,22 @@
             <w:tcW w:type="dxa" w:w="2160"/>
             <w:vAlign w:val="center"/>
             <w:tcMar>
-              <w:top w:w="100" w:type="dxa"/>
-              <w:bottom w:w="100" w:type="dxa"/>
+              <w:top w:w="85" w:type="dxa"/>
+              <w:bottom w:w="85" w:type="dxa"/>
               <w:left w:w="110" w:type="dxa"/>
               <w:right w:w="110" w:type="dxa"/>
             </w:tcMar>
           </w:tcPr>
           <w:p>
             <w:pPr>
-              <w:spacing w:after="0" w:line="276" w:lineRule="auto"/>
+              <w:spacing w:after="0" w:line="280" w:lineRule="auto" w:before="0"/>
+              <w:snapToGrid w:val="0"/>
             </w:pPr>
             <w:r>
               <w:rPr>
                 <w:b w:val="0"/>
                 <w:color w:val="595959"/>
-                <w:sz w:val="20"/>
+                <w:sz w:val="21"/>
               </w:rPr>
               <w:t>[점수 또는 등급]</w:t>
             </w:r>
@@ -947,113 +1046,153 @@
       <w:pPr>
         <w:pStyle w:val="Heading1"/>
       </w:pPr>
+      <w:bookmarkStart w:id="510" w:name="findar_summary_heading"/>
       <w:r>
         <w:t>관련 경험 및 활용 역량</w:t>
       </w:r>
+      <w:bookmarkEnd w:id="510"/>
     </w:p>
     <w:p>
+      <w:bookmarkStart w:id="511" w:name="findar_summary_line"/>
       <w:r>
         <w:rPr>
           <w:b/>
+          <w:sz w:val="21"/>
         </w:rPr>
         <w:t xml:space="preserve">관련 경험  </w:t>
       </w:r>
       <w:r>
         <w:rPr>
           <w:color w:val="595959"/>
+          <w:sz w:val="21"/>
         </w:rPr>
         <w:t>[프로젝트·교육·활동명] / [기간] / [본인 역할과 주요 내용]</w:t>
       </w:r>
+      <w:bookmarkEnd w:id="511"/>
+      <w:pPr>
+        <w:spacing w:before="0" w:after="80" w:line="280" w:lineRule="auto"/>
+      </w:pPr>
     </w:p>
     <w:p>
+      <w:bookmarkStart w:id="512" w:name="findar_summary_skills"/>
       <w:r>
         <w:rPr>
           <w:b/>
+          <w:sz w:val="21"/>
         </w:rPr>
         <w:t xml:space="preserve">활용 역량  </w:t>
       </w:r>
       <w:r>
         <w:rPr>
           <w:color w:val="595959"/>
+          <w:sz w:val="21"/>
         </w:rPr>
         <w:t>[직무 관련 지식·도구·언어와 실제 활용 범위]</w:t>
       </w:r>
+      <w:bookmarkEnd w:id="512"/>
+      <w:pPr>
+        <w:spacing w:before="0" w:after="80" w:line="280" w:lineRule="auto"/>
+      </w:pPr>
     </w:p>
     <w:p>
+      <w:bookmarkStart w:id="513" w:name="findar_summary_reference"/>
       <w:r>
         <w:rPr>
           <w:b/>
+          <w:sz w:val="21"/>
         </w:rPr>
         <w:t xml:space="preserve">참고 자료  </w:t>
       </w:r>
       <w:r>
         <w:rPr>
           <w:color w:val="595959"/>
+          <w:sz w:val="21"/>
         </w:rPr>
         <w:t>[위 경험을 확인할 수 있는 자료명 또는 링크]</w:t>
       </w:r>
+      <w:bookmarkEnd w:id="513"/>
+      <w:pPr>
+        <w:spacing w:before="0" w:after="80" w:line="280" w:lineRule="auto"/>
+      </w:pPr>
     </w:p>
     <w:p>
+      <w:bookmarkStart w:id="514" w:name="findar_details_break"/>
       <w:r>
         <w:br w:type="page"/>
       </w:r>
+      <w:bookmarkEnd w:id="514"/>
     </w:p>
     <w:p>
       <w:pPr>
         <w:pStyle w:val="Title"/>
-        <w:spacing w:before="0" w:after="160"/>
+        <w:spacing w:before="0" w:after="120"/>
       </w:pPr>
+      <w:bookmarkStart w:id="515" w:name="findar_details_title"/>
       <w:r>
         <w:rPr>
           <w:b w:val="0"/>
+          <w:sz w:val="40"/>
         </w:rPr>
         <w:t>경력 및 경험 상세</w:t>
       </w:r>
+      <w:bookmarkEnd w:id="515"/>
     </w:p>
     <w:p>
       <w:pPr>
         <w:pStyle w:val="Subtitle"/>
-        <w:spacing w:before="0" w:after="160"/>
+        <w:spacing w:before="0" w:after="120" w:line="270" w:lineRule="auto"/>
       </w:pPr>
+      <w:bookmarkStart w:id="516" w:name="findar_details_subtitle"/>
       <w:r>
         <w:rPr>
+          <w:sz w:val="21"/>
+          <w:color w:val="000000"/>
           <w:b w:val="0"/>
         </w:rPr>
-        <w:t>[지원 직무와 관련된 경험의 상세 내용]</w:t>
+        <w:t>[지원 회사]  [지원 팀 또는 직무]  [성명]</w:t>
       </w:r>
+      <w:bookmarkEnd w:id="516"/>
     </w:p>
     <w:p>
       <w:pPr>
         <w:pStyle w:val="Heading1"/>
       </w:pPr>
+      <w:bookmarkStart w:id="517" w:name="findar_details_work_heading"/>
       <w:r>
         <w:t>업무 경험</w:t>
       </w:r>
+      <w:bookmarkEnd w:id="517"/>
     </w:p>
     <w:p>
       <w:pPr>
-        <w:spacing w:before="0" w:after="80"/>
+        <w:spacing w:before="120" w:after="80"/>
       </w:pPr>
+      <w:bookmarkStart w:id="518" w:name="findar_details_work_title"/>
       <w:r>
         <w:rPr>
           <w:b/>
         </w:rPr>
         <w:t>[회사명]  [부서 및 직위]</w:t>
       </w:r>
+      <w:bookmarkEnd w:id="518"/>
     </w:p>
     <w:p>
       <w:pPr>
-        <w:spacing w:before="0" w:after="240"/>
+        <w:spacing w:before="0" w:after="80"/>
       </w:pPr>
+      <w:bookmarkStart w:id="519" w:name="findar_details_meta"/>
       <w:r>
         <w:rPr>
           <w:b w:val="0"/>
           <w:color w:val="595959"/>
+          <w:sz w:val="20"/>
         </w:rPr>
         <w:t>[YYYY.MM - YYYY.MM 또는 현재]  |  [고용 형태]</w:t>
       </w:r>
+      <w:bookmarkEnd w:id="519"/>
     </w:p>
     <w:p>
+      <w:bookmarkStart w:id="520" w:name="findar_details_work_line"/>
       <w:r>
         <w:rPr>
           <w:b/>
@@ -1066,8 +1205,10 @@
         </w:rPr>
         <w:t>[직접 맡았던 업무의 범위와 책임을 작성합니다.]</w:t>
       </w:r>
+      <w:bookmarkEnd w:id="520"/>
     </w:p>
     <w:p>
+      <w:bookmarkStart w:id="521" w:name="findar_details_work_challenge"/>
       <w:r>
         <w:rPr>
           <w:b/>
@@ -1080,8 +1221,10 @@
         </w:rPr>
         <w:t>[해결해야 했던 문제와 당시의 제약을 작성합니다.]</w:t>
       </w:r>
+      <w:bookmarkEnd w:id="521"/>
     </w:p>
     <w:p>
+      <w:bookmarkStart w:id="522" w:name="findar_details_work_contribution"/>
       <w:r>
         <w:rPr>
           <w:b/>
@@ -1094,8 +1237,10 @@
         </w:rPr>
         <w:t>[본인이 판단하고 실행한 내용을 구체적으로 작성합니다.]</w:t>
       </w:r>
+      <w:bookmarkEnd w:id="522"/>
     </w:p>
     <w:p>
+      <w:bookmarkStart w:id="523" w:name="findar_details_work_result"/>
       <w:r>
         <w:rPr>
           <w:b/>
@@ -1108,8 +1253,10 @@
         </w:rPr>
         <w:t>[확인 가능한 결과를 작성합니다. 수치는 기간과 측정 기준을 함께 적습니다.]</w:t>
       </w:r>
+      <w:bookmarkEnd w:id="523"/>
     </w:p>
     <w:p>
+      <w:bookmarkStart w:id="524" w:name="findar_details_work_relevance"/>
       <w:r>
         <w:rPr>
           <w:b/>
@@ -1122,39 +1269,48 @@
         </w:rPr>
         <w:t>[이 경험에서 설명할 수 있는 역량과 지원 업무에 활용할 부분을 작성합니다.]</w:t>
       </w:r>
+      <w:bookmarkEnd w:id="524"/>
     </w:p>
     <w:p>
       <w:pPr>
         <w:pStyle w:val="Heading1"/>
       </w:pPr>
+      <w:bookmarkStart w:id="525" w:name="findar_details_project_heading"/>
       <w:r>
         <w:t>프로젝트 및 학습 경험</w:t>
       </w:r>
+      <w:bookmarkEnd w:id="525"/>
     </w:p>
     <w:p>
       <w:pPr>
-        <w:spacing w:before="0" w:after="80"/>
+        <w:spacing w:before="120" w:after="80"/>
       </w:pPr>
+      <w:bookmarkStart w:id="526" w:name="findar_details_project_title"/>
       <w:r>
         <w:rPr>
           <w:b/>
         </w:rPr>
         <w:t>[프로젝트명 또는 교육 및 연구 주제]</w:t>
       </w:r>
+      <w:bookmarkEnd w:id="526"/>
     </w:p>
     <w:p>
       <w:pPr>
-        <w:spacing w:before="0" w:after="240"/>
+        <w:spacing w:before="0" w:after="80"/>
       </w:pPr>
+      <w:bookmarkStart w:id="527" w:name="findar_details_project_meta"/>
       <w:r>
         <w:rPr>
           <w:b w:val="0"/>
           <w:color w:val="595959"/>
+          <w:sz w:val="20"/>
         </w:rPr>
         <w:t>[YYYY.MM - YYYY.MM]  |  [개인 프로젝트·팀 프로젝트·교육 등 실제 구분]</w:t>
       </w:r>
+      <w:bookmarkEnd w:id="527"/>
     </w:p>
     <w:p>
+      <w:bookmarkStart w:id="528" w:name="findar_details_project_scope"/>
       <w:r>
         <w:rPr>
           <w:b/>
@@ -1167,8 +1323,10 @@
         </w:rPr>
         <w:t>[수행 목적, 다룬 주제, 사용한 자료나 도구를 작성합니다.]</w:t>
       </w:r>
+      <w:bookmarkEnd w:id="528"/>
     </w:p>
     <w:p>
+      <w:bookmarkStart w:id="529" w:name="findar_details_project_role"/>
       <w:r>
         <w:rPr>
           <w:b/>
@@ -1181,8 +1339,10 @@
         </w:rPr>
         <w:t>[개인 작업의 범위 또는 팀에서 맡은 역할을 작성합니다.]</w:t>
       </w:r>
+      <w:bookmarkEnd w:id="529"/>
     </w:p>
     <w:p>
+      <w:bookmarkStart w:id="530" w:name="findar_details_project_line"/>
       <w:r>
         <w:rPr>
           <w:b/>
@@ -1195,8 +1355,10 @@
         </w:rPr>
         <w:t>[분석·구현·검증 등 실제 수행한 절차를 작성합니다.]</w:t>
       </w:r>
+      <w:bookmarkEnd w:id="530"/>
     </w:p>
     <w:p>
+      <w:bookmarkStart w:id="531" w:name="findar_details_project_result"/>
       <w:r>
         <w:rPr>
           <w:b/>
@@ -1209,8 +1371,10 @@
         </w:rPr>
         <w:t>[산출물과 확인한 결과, 자료나 방법의 한계를 작성합니다.]</w:t>
       </w:r>
+      <w:bookmarkEnd w:id="531"/>
     </w:p>
     <w:p>
+      <w:bookmarkStart w:id="532" w:name="findar_details_project_reference"/>
       <w:r>
         <w:rPr>
           <w:b/>
@@ -1223,48 +1387,61 @@
         </w:rPr>
         <w:t>[공개 가능한 보고서·코드·발표 자료 등의 제목 또는 링크]</w:t>
       </w:r>
+      <w:bookmarkEnd w:id="532"/>
     </w:p>
     <w:p>
+      <w:bookmarkStart w:id="533" w:name="findar_essay_break"/>
       <w:r>
         <w:br w:type="page"/>
       </w:r>
+      <w:bookmarkEnd w:id="533"/>
     </w:p>
     <w:p>
       <w:pPr>
         <w:pStyle w:val="Title"/>
-        <w:spacing w:before="0" w:after="160"/>
+        <w:spacing w:before="0" w:after="120"/>
       </w:pPr>
+      <w:bookmarkStart w:id="534" w:name="findar_essay_title"/>
       <w:r>
         <w:rPr>
           <w:b w:val="0"/>
+          <w:sz w:val="40"/>
         </w:rPr>
         <w:t>자기소개서</w:t>
       </w:r>
+      <w:bookmarkEnd w:id="534"/>
     </w:p>
     <w:p>
       <w:pPr>
         <w:pStyle w:val="Subtitle"/>
-        <w:spacing w:before="0" w:after="240"/>
+        <w:spacing w:before="0" w:after="120" w:line="270" w:lineRule="auto"/>
       </w:pPr>
+      <w:bookmarkStart w:id="535" w:name="findar_essay_identity"/>
       <w:r>
         <w:rPr>
+          <w:sz w:val="21"/>
+          <w:color w:val="000000"/>
           <w:b w:val="0"/>
         </w:rPr>
-        <w:t>[지원 회사]  [지원 직무]  [성명]</w:t>
+        <w:t>[지원 회사]  [지원 팀 또는 직무]  [성명]</w:t>
       </w:r>
+      <w:bookmarkEnd w:id="535"/>
     </w:p>
     <w:p>
       <w:pPr>
         <w:pStyle w:val="Heading1"/>
       </w:pPr>
+      <w:bookmarkStart w:id="536" w:name="findar_essay_question"/>
       <w:r>
         <w:t>지원동기</w:t>
       </w:r>
+      <w:bookmarkEnd w:id="536"/>
     </w:p>
     <w:p>
       <w:pPr>
         <w:spacing w:before="0" w:after="200"/>
       </w:pPr>
+      <w:bookmarkStart w:id="537" w:name="findar_essay_body"/>
       <w:r>
         <w:rPr>
           <w:b w:val="0"/>
@@ -1272,11 +1449,13 @@
         </w:rPr>
         <w:t>[이 직무에 지원하게 된 계기와 실제 준비 과정을 작성합니다. 관심을 갖게 된 이유를 구체적인 경험이나 행동으로 설명합니다.]</w:t>
       </w:r>
+      <w:bookmarkEnd w:id="537"/>
     </w:p>
     <w:p>
       <w:pPr>
         <w:spacing w:before="0" w:after="680"/>
       </w:pPr>
+      <w:bookmarkStart w:id="538" w:name="findar_essay_body_end"/>
       <w:r>
         <w:rPr>
           <w:b w:val="0"/>
@@ -1284,19 +1463,23 @@
         </w:rPr>
         <w:t>[해당 회사를 선택한 근거를 확인된 정보에 바탕을 두고 작성합니다. 공고에 제시된 업무 중 어떤 일에 기여하고 싶은지 연결합니다.]</w:t>
       </w:r>
+      <w:bookmarkEnd w:id="538"/>
     </w:p>
     <w:p>
       <w:pPr>
         <w:pStyle w:val="Heading1"/>
       </w:pPr>
+      <w:bookmarkStart w:id="539" w:name="findar_essay_question_second"/>
       <w:r>
         <w:t>직무 관련 역량</w:t>
       </w:r>
+      <w:bookmarkEnd w:id="539"/>
     </w:p>
     <w:p>
       <w:pPr>
         <w:spacing w:before="0" w:after="200"/>
       </w:pPr>
+      <w:bookmarkStart w:id="540" w:name="findar_essay_body_second"/>
       <w:r>
         <w:rPr>
           <w:b w:val="0"/>
@@ -1304,11 +1487,13 @@
         </w:rPr>
         <w:t>[지원 업무에 필요한 역량을 보여주는 경험을 고릅니다. 상황과 목표, 맡은 역할을 간결하게 밝힌 뒤 본인이 한 행동을 중심으로 작성합니다.]</w:t>
       </w:r>
+      <w:bookmarkEnd w:id="540"/>
     </w:p>
     <w:p>
       <w:pPr>
         <w:spacing w:before="0" w:after="680"/>
       </w:pPr>
+      <w:bookmarkStart w:id="541" w:name="findar_essay_body_second_end"/>
       <w:r>
         <w:rPr>
           <w:b w:val="0"/>
@@ -1316,19 +1501,23 @@
         </w:rPr>
         <w:t>[결과와 이를 뒷받침할 근거를 작성합니다. 경험의 범위 안에서 설명할 수 있는 역량과, 지원 업무에 어떻게 활용할 수 있는지 정리합니다.]</w:t>
       </w:r>
+      <w:bookmarkEnd w:id="541"/>
     </w:p>
     <w:p>
       <w:pPr>
         <w:pStyle w:val="Heading1"/>
       </w:pPr>
+      <w:bookmarkStart w:id="542" w:name="findar_essay_question_third"/>
       <w:r>
         <w:t>일하는 방식</w:t>
       </w:r>
+      <w:bookmarkEnd w:id="542"/>
     </w:p>
     <w:p>
       <w:pPr>
         <w:spacing w:before="0" w:after="200"/>
       </w:pPr>
+      <w:bookmarkStart w:id="543" w:name="findar_essay_body_third"/>
       <w:r>
         <w:rPr>
           <w:b w:val="0"/>
@@ -1336,11 +1525,13 @@
         </w:rPr>
         <w:t>[문제 해결·검증·협업 중 자신을 잘 보여주는 사례를 작성합니다. 앞의 사례와 겹치면 다른 행동이나 판단을 보여줄 수 있는 경험을 선택합니다.]</w:t>
       </w:r>
+      <w:bookmarkEnd w:id="543"/>
     </w:p>
     <w:p>
       <w:pPr>
         <w:spacing w:before="0" w:after="120"/>
       </w:pPr>
+      <w:bookmarkStart w:id="544" w:name="findar_essay_body_third_end"/>
       <w:r>
         <w:rPr>
           <w:b w:val="0"/>
@@ -1348,6 +1539,7 @@
         </w:rPr>
         <w:t>[판단한 이유, 실행 과정, 결과를 작성하고 업무를 수행할 때 적용할 방식을 설명합니다. 공고가 다른 내용을 요구하면 이 소제목과 본문을 바꿉니다.]</w:t>
       </w:r>
+      <w:bookmarkEnd w:id="544"/>
     </w:p>
     <w:sectPr>
       <w:headerReference w:type="default" r:id="rId9"/>
@@ -1757,7 +1949,8 @@
     <w:qFormat/>
     <w:rsid w:val="00FC693F"/>
     <w:pPr>
-      <w:spacing w:after="120" w:line="300" w:lineRule="auto"/>
+      <w:spacing w:after="100" w:line="300" w:lineRule="auto"/>
+      <w:snapToGrid w:val="0"/>
     </w:pPr>
     <w:rPr>
       <w:rFonts w:ascii="Nanum Gothic" w:hAnsi="Nanum Gothic" w:eastAsia="Nanum Gothic" w:cs="Nanum Gothic"/>
@@ -1780,6 +1973,7 @@
         <w:tab w:val="right" w:pos="9360"/>
       </w:tabs>
       <w:spacing w:after="0" w:line="240" w:lineRule="auto"/>
+      <w:snapToGrid w:val="0"/>
     </w:pPr>
     <w:rPr>
       <w:rFonts w:ascii="Nanum Gothic" w:hAnsi="Nanum Gothic" w:eastAsia="Nanum Gothic" w:cs="Nanum Gothic"/>
@@ -1809,6 +2003,7 @@
         <w:tab w:val="right" w:pos="9360"/>
       </w:tabs>
       <w:spacing w:after="0" w:line="240" w:lineRule="auto"/>
+      <w:snapToGrid w:val="0"/>
     </w:pPr>
     <w:rPr>
       <w:rFonts w:ascii="Nanum Gothic" w:hAnsi="Nanum Gothic" w:eastAsia="Nanum Gothic" w:cs="Nanum Gothic"/>
@@ -1836,8 +2031,9 @@
     <w:pPr>
       <w:keepNext/>
       <w:keepLines/>
-      <w:spacing w:before="340" w:after="160"/>
+      <w:spacing w:before="240" w:after="120" w:line="280" w:lineRule="auto"/>
       <w:outlineLvl w:val="0"/>
+      <w:snapToGrid w:val="0"/>
     </w:pPr>
     <w:rPr>
       <w:rFonts w:cstheme="majorBidi" w:ascii="Nanum Gothic" w:hAnsi="Nanum Gothic" w:eastAsia="Nanum Gothic" w:cs="Nanum Gothic"/>
@@ -1861,8 +2057,9 @@
     <w:pPr>
       <w:keepNext/>
       <w:keepLines/>
-      <w:spacing w:before="200" w:after="100"/>
+      <w:spacing w:before="160" w:after="100"/>
       <w:outlineLvl w:val="1"/>
+      <w:snapToGrid w:val="0"/>
     </w:pPr>
     <w:rPr>
       <w:rFonts w:cstheme="majorBidi" w:ascii="Nanum Gothic" w:hAnsi="Nanum Gothic" w:eastAsia="Nanum Gothic" w:cs="Nanum Gothic"/>
@@ -2127,6 +2324,7 @@
       <w:keepNext/>
       <w:spacing w:after="160" w:line="240" w:lineRule="auto"/>
       <w:contextualSpacing/>
+      <w:snapToGrid w:val="0"/>
     </w:pPr>
     <w:rPr>
       <w:rFonts w:cstheme="majorBidi" w:ascii="Nanum Gothic" w:hAnsi="Nanum Gothic" w:eastAsia="Nanum Gothic" w:cs="Nanum Gothic"/>
@@ -2166,6 +2364,7 @@
       <w:numPr>
         <w:ilvl w:val="1"/>
       </w:numPr>
+      <w:snapToGrid w:val="0"/>
     </w:pPr>
     <w:rPr>
       <w:rFonts w:cstheme="majorBidi" w:ascii="Nanum Gothic" w:hAnsi="Nanum Gothic" w:eastAsia="Nanum Gothic" w:cs="Nanum Gothic"/>

</xml_diff>

<commit_message>
feat: redesign freeform applications with finance-sector form layout
</commit_message>
<xml_diff>
--- a/assets/templates/freeform-application.docx
+++ b/assets/templates/freeform-application.docx
@@ -5,142 +5,443 @@
     <w:p>
       <w:pPr>
         <w:pStyle w:val="Title"/>
-        <w:spacing w:before="0" w:after="80" w:line="260" w:lineRule="auto"/>
       </w:pPr>
-      <w:bookmarkStart w:id="500" w:name="findar_resume_title"/>
+      <w:bookmarkStart w:id="100" w:name="findar_resume_title"/>
       <w:r>
         <w:rPr>
-          <w:sz w:val="22"/>
+          <w:rFonts w:ascii="Nanum Gothic" w:hAnsi="Nanum Gothic" w:eastAsia="Nanum Gothic" w:cs="Nanum Gothic"/>
+          <w:b/>
           <w:color w:val="000000"/>
-          <w:b w:val="1"/>
+          <w:sz w:val="40"/>
         </w:rPr>
         <w:t>입사지원서</w:t>
       </w:r>
-      <w:bookmarkEnd w:id="500"/>
+      <w:bookmarkEnd w:id="100"/>
     </w:p>
-    <w:p>
-      <w:pPr>
-        <w:spacing w:before="0" w:after="60" w:line="280" w:lineRule="auto"/>
-        <w:keepNext/>
-      </w:pPr>
-      <w:bookmarkStart w:id="600" w:name="findar_resume_company"/>
-      <w:r>
-        <w:rPr>
-          <w:sz w:val="44"/>
-          <w:color w:val="000000"/>
-          <w:b w:val="1"/>
-        </w:rPr>
-        <w:t>[지원 회사]</w:t>
-      </w:r>
-      <w:bookmarkEnd w:id="600"/>
-    </w:p>
-    <w:p>
-      <w:pPr>
-        <w:spacing w:before="0" w:after="100" w:line="280" w:lineRule="auto"/>
-        <w:keepNext/>
-      </w:pPr>
-      <w:bookmarkStart w:id="601" w:name="findar_resume_role"/>
-      <w:r>
-        <w:rPr>
-          <w:sz w:val="20"/>
-          <w:color w:val="000000"/>
-          <w:b w:val="0"/>
-        </w:rPr>
-        <w:t xml:space="preserve">지원 팀 및 직무  </w:t>
-      </w:r>
-      <w:r>
-        <w:rPr>
-          <w:sz w:val="28"/>
-          <w:color w:val="000000"/>
-          <w:b w:val="1"/>
-        </w:rPr>
-        <w:t>[지원 팀 또는 직무]</w:t>
-      </w:r>
-      <w:bookmarkEnd w:id="601"/>
-    </w:p>
-    <w:p>
-      <w:pPr>
-        <w:spacing w:before="0" w:after="40" w:line="260" w:lineRule="auto"/>
-      </w:pPr>
-      <w:bookmarkStart w:id="501" w:name="findar_resume_name"/>
-      <w:r>
-        <w:rPr>
-          <w:sz w:val="20"/>
-          <w:color w:val="000000"/>
-          <w:b w:val="0"/>
-        </w:rPr>
-        <w:t xml:space="preserve">지원자  </w:t>
-      </w:r>
-      <w:r>
-        <w:rPr>
-          <w:sz w:val="30"/>
-          <w:color w:val="000000"/>
-          <w:b w:val="1"/>
-        </w:rPr>
-        <w:t>[성명]</w:t>
-      </w:r>
-      <w:bookmarkEnd w:id="501"/>
-    </w:p>
-    <w:p>
-      <w:pPr>
-        <w:spacing w:before="0" w:after="60" w:line="260" w:lineRule="auto"/>
-      </w:pPr>
-      <w:bookmarkStart w:id="502" w:name="findar_resume_contact"/>
-      <w:r>
-        <w:rPr>
-          <w:b w:val="0"/>
-          <w:sz w:val="21"/>
-        </w:rPr>
-        <w:t>[연락처]  |  [이메일]</w:t>
-      </w:r>
-      <w:bookmarkEnd w:id="502"/>
-    </w:p>
-    <w:p>
-      <w:pPr>
-        <w:spacing w:before="0" w:after="60" w:line="260" w:lineRule="auto"/>
-      </w:pPr>
-      <w:bookmarkStart w:id="503" w:name="findar_resume_extra"/>
-      <w:r>
-        <w:rPr>
-          <w:b w:val="0"/>
-          <w:color w:val="595959"/>
-          <w:sz w:val="21"/>
-        </w:rPr>
-        <w:t>[거주 지역 또는 포트폴리오 주소 등 필요한 연락 정보]</w:t>
-      </w:r>
-      <w:bookmarkEnd w:id="503"/>
-    </w:p>
+    <w:tbl>
+      <w:tblPr>
+        <w:tblW w:type="dxa" w:w="9865"/>
+        <w:jc w:val="center"/>
+        <w:tblLayout w:type="fixed"/>
+        <w:tblLook w:firstColumn="1" w:firstRow="1" w:lastColumn="0" w:lastRow="0" w:noHBand="0" w:noVBand="1" w:val="04A0"/>
+        <w:tblInd w:w="0" w:type="dxa"/>
+        <w:tblBorders>
+          <w:top w:val="single" w:sz="5" w:color="B9BEC4"/>
+          <w:bottom w:val="single" w:sz="5" w:color="B9BEC4"/>
+          <w:left w:val="single" w:sz="5" w:color="B9BEC4"/>
+          <w:right w:val="single" w:sz="5" w:color="B9BEC4"/>
+          <w:insideH w:val="single" w:sz="5" w:color="B9BEC4"/>
+          <w:insideV w:val="single" w:sz="5" w:color="B9BEC4"/>
+        </w:tblBorders>
+        <w:tblCellMar>
+          <w:top w:w="60" w:type="dxa"/>
+          <w:bottom w:w="60" w:type="dxa"/>
+          <w:left w:w="100" w:type="dxa"/>
+          <w:right w:w="100" w:type="dxa"/>
+        </w:tblCellMar>
+        <w:tblCaption w:val="findar_resume_target"/>
+      </w:tblPr>
+      <w:tblGrid>
+        <w:gridCol w:w="1361"/>
+        <w:gridCol w:w="4535"/>
+        <w:gridCol w:w="1361"/>
+        <w:gridCol w:w="2608"/>
+      </w:tblGrid>
+      <w:tr>
+        <w:trPr>
+          <w:cantSplit/>
+        </w:trPr>
+        <w:tc>
+          <w:tcPr>
+            <w:tcW w:type="dxa" w:w="1361"/>
+            <w:vAlign w:val="center"/>
+            <w:shd w:fill="F0F1F2" w:val="clear"/>
+          </w:tcPr>
+          <w:p>
+            <w:pPr>
+              <w:keepNext w:val="0"/>
+              <w:spacing w:after="0" w:line="276" w:lineRule="auto"/>
+              <w:snapToGrid w:val="0"/>
+              <w:jc w:val="center"/>
+            </w:pPr>
+            <w:r>
+              <w:rPr>
+                <w:rFonts w:ascii="Nanum Gothic" w:hAnsi="Nanum Gothic" w:eastAsia="Nanum Gothic" w:cs="Nanum Gothic"/>
+                <w:b/>
+                <w:color w:val="000000"/>
+                <w:sz w:val="22"/>
+              </w:rPr>
+              <w:t>지원 회사</w:t>
+            </w:r>
+          </w:p>
+        </w:tc>
+        <w:tc>
+          <w:tcPr>
+            <w:tcW w:type="dxa" w:w="8504"/>
+            <w:gridSpan w:val="3"/>
+            <w:vAlign w:val="center"/>
+          </w:tcPr>
+          <w:p>
+            <w:pPr>
+              <w:keepNext w:val="0"/>
+              <w:spacing w:after="0" w:line="276" w:lineRule="auto"/>
+              <w:snapToGrid w:val="0"/>
+              <w:jc w:val="left"/>
+            </w:pPr>
+            <w:r>
+              <w:rPr>
+                <w:rFonts w:ascii="Nanum Gothic" w:hAnsi="Nanum Gothic" w:eastAsia="Nanum Gothic" w:cs="Nanum Gothic"/>
+                <w:b/>
+                <w:color w:val="000000"/>
+                <w:sz w:val="22"/>
+              </w:rPr>
+              <w:t>[지원 회사]</w:t>
+            </w:r>
+          </w:p>
+        </w:tc>
+      </w:tr>
+      <w:tr>
+        <w:trPr>
+          <w:cantSplit/>
+        </w:trPr>
+        <w:tc>
+          <w:tcPr>
+            <w:tcW w:type="dxa" w:w="1361"/>
+            <w:vAlign w:val="center"/>
+            <w:shd w:fill="F0F1F2" w:val="clear"/>
+          </w:tcPr>
+          <w:p>
+            <w:pPr>
+              <w:keepNext w:val="0"/>
+              <w:spacing w:after="0" w:line="276" w:lineRule="auto"/>
+              <w:snapToGrid w:val="0"/>
+              <w:jc w:val="center"/>
+            </w:pPr>
+            <w:r>
+              <w:rPr>
+                <w:rFonts w:ascii="Nanum Gothic" w:hAnsi="Nanum Gothic" w:eastAsia="Nanum Gothic" w:cs="Nanum Gothic"/>
+                <w:b/>
+                <w:color w:val="000000"/>
+                <w:sz w:val="22"/>
+              </w:rPr>
+              <w:t>지원 부서</w:t>
+            </w:r>
+          </w:p>
+        </w:tc>
+        <w:tc>
+          <w:tcPr>
+            <w:tcW w:type="dxa" w:w="4535"/>
+            <w:vAlign w:val="center"/>
+          </w:tcPr>
+          <w:p>
+            <w:pPr>
+              <w:keepNext w:val="0"/>
+              <w:spacing w:after="0" w:line="276" w:lineRule="auto"/>
+              <w:snapToGrid w:val="0"/>
+              <w:jc w:val="left"/>
+            </w:pPr>
+            <w:r>
+              <w:rPr>
+                <w:rFonts w:ascii="Nanum Gothic" w:hAnsi="Nanum Gothic" w:eastAsia="Nanum Gothic" w:cs="Nanum Gothic"/>
+                <w:b/>
+                <w:color w:val="000000"/>
+                <w:sz w:val="22"/>
+              </w:rPr>
+              <w:t>[지원 팀 또는 직무]</w:t>
+            </w:r>
+          </w:p>
+        </w:tc>
+        <w:tc>
+          <w:tcPr>
+            <w:tcW w:type="dxa" w:w="1361"/>
+            <w:vAlign w:val="center"/>
+            <w:shd w:fill="F0F1F2" w:val="clear"/>
+          </w:tcPr>
+          <w:p>
+            <w:pPr>
+              <w:keepNext w:val="0"/>
+              <w:spacing w:after="0" w:line="276" w:lineRule="auto"/>
+              <w:snapToGrid w:val="0"/>
+              <w:jc w:val="center"/>
+            </w:pPr>
+            <w:r>
+              <w:rPr>
+                <w:rFonts w:ascii="Nanum Gothic" w:hAnsi="Nanum Gothic" w:eastAsia="Nanum Gothic" w:cs="Nanum Gothic"/>
+                <w:b/>
+                <w:color w:val="000000"/>
+                <w:sz w:val="22"/>
+              </w:rPr>
+              <w:t>지원 구분</w:t>
+            </w:r>
+          </w:p>
+        </w:tc>
+        <w:tc>
+          <w:tcPr>
+            <w:tcW w:type="dxa" w:w="2608"/>
+            <w:vAlign w:val="center"/>
+          </w:tcPr>
+          <w:p>
+            <w:pPr>
+              <w:keepNext w:val="0"/>
+              <w:spacing w:after="0" w:line="276" w:lineRule="auto"/>
+              <w:snapToGrid w:val="0"/>
+              <w:jc w:val="left"/>
+            </w:pPr>
+            <w:r>
+              <w:rPr>
+                <w:rFonts w:ascii="Nanum Gothic" w:hAnsi="Nanum Gothic" w:eastAsia="Nanum Gothic" w:cs="Nanum Gothic"/>
+                <w:b w:val="0"/>
+                <w:color w:val="000000"/>
+                <w:sz w:val="22"/>
+              </w:rPr>
+              <w:t>[신입 / 경력 / 인턴]</w:t>
+            </w:r>
+          </w:p>
+        </w:tc>
+      </w:tr>
+    </w:tbl>
     <w:p>
       <w:pPr>
         <w:pStyle w:val="Heading1"/>
       </w:pPr>
-      <w:bookmarkStart w:id="504" w:name="findar_education_heading"/>
+      <w:bookmarkStart w:id="102" w:name="findar_personal_heading"/>
       <w:r>
-        <w:t>학력</w:t>
+        <w:rPr>
+          <w:rFonts w:ascii="Nanum Gothic" w:hAnsi="Nanum Gothic" w:eastAsia="Nanum Gothic" w:cs="Nanum Gothic"/>
+          <w:b/>
+          <w:color w:val="000000"/>
+          <w:sz w:val="22"/>
+        </w:rPr>
+        <w:t>1. 기본 인적사항</w:t>
       </w:r>
-      <w:bookmarkEnd w:id="504"/>
+      <w:bookmarkEnd w:id="102"/>
     </w:p>
     <w:tbl>
       <w:tblPr>
-        <w:tblW w:type="auto" w:w="0"/>
+        <w:tblW w:type="dxa" w:w="9865"/>
         <w:jc w:val="center"/>
         <w:tblLayout w:type="fixed"/>
         <w:tblLook w:firstColumn="1" w:firstRow="1" w:lastColumn="0" w:lastRow="0" w:noHBand="0" w:noVBand="1" w:val="04A0"/>
+        <w:tblInd w:w="0" w:type="dxa"/>
         <w:tblBorders>
-          <w:top w:val="single" w:sz="4" w:color="D9D9D9"/>
-          <w:left w:val="single" w:sz="4" w:color="D9D9D9"/>
-          <w:bottom w:val="single" w:sz="4" w:color="D9D9D9"/>
-          <w:right w:val="single" w:sz="4" w:color="D9D9D9"/>
-          <w:insideH w:val="single" w:sz="4" w:color="D9D9D9"/>
-          <w:insideV w:val="single" w:sz="4" w:color="D9D9D9"/>
+          <w:top w:val="single" w:sz="5" w:color="B9BEC4"/>
+          <w:bottom w:val="single" w:sz="5" w:color="B9BEC4"/>
+          <w:left w:val="single" w:sz="5" w:color="B9BEC4"/>
+          <w:right w:val="single" w:sz="5" w:color="B9BEC4"/>
+          <w:insideH w:val="single" w:sz="5" w:color="B9BEC4"/>
+          <w:insideV w:val="single" w:sz="5" w:color="B9BEC4"/>
         </w:tblBorders>
+        <w:tblCellMar>
+          <w:top w:w="60" w:type="dxa"/>
+          <w:bottom w:w="60" w:type="dxa"/>
+          <w:left w:w="100" w:type="dxa"/>
+          <w:right w:w="100" w:type="dxa"/>
+        </w:tblCellMar>
+        <w:tblCaption w:val="findar_personal_table"/>
+      </w:tblPr>
+      <w:tblGrid>
+        <w:gridCol w:w="1361"/>
+        <w:gridCol w:w="3572"/>
+        <w:gridCol w:w="1361"/>
+        <w:gridCol w:w="3572"/>
+      </w:tblGrid>
+      <w:tr>
+        <w:trPr>
+          <w:cantSplit/>
+        </w:trPr>
+        <w:tc>
+          <w:tcPr>
+            <w:tcW w:type="dxa" w:w="1361"/>
+            <w:vAlign w:val="center"/>
+            <w:shd w:fill="F0F1F2" w:val="clear"/>
+          </w:tcPr>
+          <w:p>
+            <w:pPr>
+              <w:keepNext w:val="0"/>
+              <w:spacing w:after="0" w:line="276" w:lineRule="auto"/>
+              <w:snapToGrid w:val="0"/>
+              <w:jc w:val="center"/>
+            </w:pPr>
+            <w:r>
+              <w:rPr>
+                <w:rFonts w:ascii="Nanum Gothic" w:hAnsi="Nanum Gothic" w:eastAsia="Nanum Gothic" w:cs="Nanum Gothic"/>
+                <w:b/>
+                <w:color w:val="000000"/>
+                <w:sz w:val="21"/>
+              </w:rPr>
+              <w:t>성명</w:t>
+            </w:r>
+          </w:p>
+        </w:tc>
+        <w:tc>
+          <w:tcPr>
+            <w:tcW w:type="dxa" w:w="3572"/>
+            <w:vAlign w:val="center"/>
+          </w:tcPr>
+          <w:p>
+            <w:pPr>
+              <w:keepNext w:val="0"/>
+              <w:spacing w:after="0" w:line="276" w:lineRule="auto"/>
+              <w:snapToGrid w:val="0"/>
+              <w:jc w:val="left"/>
+            </w:pPr>
+            <w:r>
+              <w:rPr>
+                <w:rFonts w:ascii="Nanum Gothic" w:hAnsi="Nanum Gothic" w:eastAsia="Nanum Gothic" w:cs="Nanum Gothic"/>
+                <w:b w:val="0"/>
+                <w:color w:val="000000"/>
+                <w:sz w:val="21"/>
+              </w:rPr>
+              <w:t>[성명]</w:t>
+            </w:r>
+          </w:p>
+        </w:tc>
+        <w:tc>
+          <w:tcPr>
+            <w:tcW w:type="dxa" w:w="1361"/>
+            <w:vAlign w:val="center"/>
+            <w:shd w:fill="F0F1F2" w:val="clear"/>
+          </w:tcPr>
+          <w:p>
+            <w:pPr>
+              <w:keepNext w:val="0"/>
+              <w:spacing w:after="0" w:line="276" w:lineRule="auto"/>
+              <w:snapToGrid w:val="0"/>
+              <w:jc w:val="center"/>
+            </w:pPr>
+            <w:r>
+              <w:rPr>
+                <w:rFonts w:ascii="Nanum Gothic" w:hAnsi="Nanum Gothic" w:eastAsia="Nanum Gothic" w:cs="Nanum Gothic"/>
+                <w:b/>
+                <w:color w:val="000000"/>
+                <w:sz w:val="21"/>
+              </w:rPr>
+              <w:t>연락처</w:t>
+            </w:r>
+          </w:p>
+        </w:tc>
+        <w:tc>
+          <w:tcPr>
+            <w:tcW w:type="dxa" w:w="3572"/>
+            <w:vAlign w:val="center"/>
+          </w:tcPr>
+          <w:p>
+            <w:pPr>
+              <w:keepNext w:val="0"/>
+              <w:spacing w:after="0" w:line="276" w:lineRule="auto"/>
+              <w:snapToGrid w:val="0"/>
+              <w:jc w:val="left"/>
+            </w:pPr>
+            <w:r>
+              <w:rPr>
+                <w:rFonts w:ascii="Nanum Gothic" w:hAnsi="Nanum Gothic" w:eastAsia="Nanum Gothic" w:cs="Nanum Gothic"/>
+                <w:b w:val="0"/>
+                <w:color w:val="000000"/>
+                <w:sz w:val="21"/>
+              </w:rPr>
+              <w:t>[연락처]</w:t>
+            </w:r>
+          </w:p>
+        </w:tc>
+      </w:tr>
+      <w:tr>
+        <w:trPr>
+          <w:cantSplit/>
+        </w:trPr>
+        <w:tc>
+          <w:tcPr>
+            <w:tcW w:type="dxa" w:w="1361"/>
+            <w:vAlign w:val="center"/>
+            <w:shd w:fill="F0F1F2" w:val="clear"/>
+          </w:tcPr>
+          <w:p>
+            <w:pPr>
+              <w:keepNext w:val="0"/>
+              <w:spacing w:after="0" w:line="276" w:lineRule="auto"/>
+              <w:snapToGrid w:val="0"/>
+              <w:jc w:val="center"/>
+            </w:pPr>
+            <w:r>
+              <w:rPr>
+                <w:rFonts w:ascii="Nanum Gothic" w:hAnsi="Nanum Gothic" w:eastAsia="Nanum Gothic" w:cs="Nanum Gothic"/>
+                <w:b/>
+                <w:color w:val="000000"/>
+                <w:sz w:val="21"/>
+              </w:rPr>
+              <w:t>이메일</w:t>
+            </w:r>
+          </w:p>
+        </w:tc>
+        <w:tc>
+          <w:tcPr>
+            <w:tcW w:type="dxa" w:w="8505"/>
+            <w:gridSpan w:val="3"/>
+            <w:vAlign w:val="center"/>
+          </w:tcPr>
+          <w:p>
+            <w:pPr>
+              <w:keepNext w:val="0"/>
+              <w:spacing w:after="0" w:line="276" w:lineRule="auto"/>
+              <w:snapToGrid w:val="0"/>
+              <w:jc w:val="left"/>
+            </w:pPr>
+            <w:r>
+              <w:rPr>
+                <w:rFonts w:ascii="Nanum Gothic" w:hAnsi="Nanum Gothic" w:eastAsia="Nanum Gothic" w:cs="Nanum Gothic"/>
+                <w:b w:val="0"/>
+                <w:color w:val="000000"/>
+                <w:sz w:val="21"/>
+              </w:rPr>
+              <w:t>[이메일]</w:t>
+            </w:r>
+          </w:p>
+        </w:tc>
+      </w:tr>
+    </w:tbl>
+    <w:p>
+      <w:pPr>
+        <w:pStyle w:val="Heading1"/>
+      </w:pPr>
+      <w:bookmarkStart w:id="104" w:name="findar_education_heading"/>
+      <w:r>
+        <w:rPr>
+          <w:rFonts w:ascii="Nanum Gothic" w:hAnsi="Nanum Gothic" w:eastAsia="Nanum Gothic" w:cs="Nanum Gothic"/>
+          <w:b/>
+          <w:color w:val="000000"/>
+          <w:sz w:val="22"/>
+        </w:rPr>
+        <w:t>2. 학력사항</w:t>
+      </w:r>
+      <w:bookmarkEnd w:id="104"/>
+    </w:p>
+    <w:tbl>
+      <w:tblPr>
+        <w:tblW w:type="dxa" w:w="9865"/>
+        <w:jc w:val="center"/>
+        <w:tblLayout w:type="fixed"/>
+        <w:tblLook w:firstColumn="1" w:firstRow="1" w:lastColumn="0" w:lastRow="0" w:noHBand="0" w:noVBand="1" w:val="04A0"/>
+        <w:tblInd w:w="0" w:type="dxa"/>
+        <w:tblBorders>
+          <w:top w:val="single" w:sz="5" w:color="B9BEC4"/>
+          <w:bottom w:val="single" w:sz="5" w:color="B9BEC4"/>
+          <w:left w:val="single" w:sz="5" w:color="B9BEC4"/>
+          <w:right w:val="single" w:sz="5" w:color="B9BEC4"/>
+          <w:insideH w:val="single" w:sz="5" w:color="B9BEC4"/>
+          <w:insideV w:val="single" w:sz="5" w:color="B9BEC4"/>
+        </w:tblBorders>
+        <w:tblCellMar>
+          <w:top w:w="60" w:type="dxa"/>
+          <w:bottom w:w="60" w:type="dxa"/>
+          <w:left w:w="100" w:type="dxa"/>
+          <w:right w:w="100" w:type="dxa"/>
+        </w:tblCellMar>
         <w:tblCaption w:val="findar_education_table"/>
       </w:tblPr>
       <w:tblGrid>
-        <w:gridCol w:w="1944"/>
-        <w:gridCol w:w="3528"/>
-        <w:gridCol w:w="2088"/>
-        <w:gridCol w:w="2606"/>
+        <w:gridCol w:w="1757"/>
+        <w:gridCol w:w="3855"/>
+        <w:gridCol w:w="2721"/>
+        <w:gridCol w:w="1531"/>
       </w:tblGrid>
       <w:tr>
         <w:trPr>
@@ -149,24 +450,20 @@
         </w:trPr>
         <w:tc>
           <w:tcPr>
-            <w:tcW w:type="dxa" w:w="1944"/>
+            <w:tcW w:type="dxa" w:w="1757"/>
             <w:vAlign w:val="center"/>
-            <w:tcMar>
-              <w:top w:w="85" w:type="dxa"/>
-              <w:bottom w:w="85" w:type="dxa"/>
-              <w:left w:w="110" w:type="dxa"/>
-              <w:right w:w="110" w:type="dxa"/>
-            </w:tcMar>
-            <w:shd w:fill="F1F2F3"/>
+            <w:shd w:fill="F0F1F2" w:val="clear"/>
           </w:tcPr>
           <w:p>
             <w:pPr>
-              <w:spacing w:after="0" w:line="280" w:lineRule="auto" w:before="0"/>
+              <w:keepNext w:val="0"/>
+              <w:spacing w:after="0" w:line="276" w:lineRule="auto"/>
+              <w:snapToGrid w:val="0"/>
               <w:jc w:val="center"/>
-              <w:snapToGrid w:val="0"/>
             </w:pPr>
             <w:r>
               <w:rPr>
+                <w:rFonts w:ascii="Nanum Gothic" w:hAnsi="Nanum Gothic" w:eastAsia="Nanum Gothic" w:cs="Nanum Gothic"/>
                 <w:b/>
                 <w:color w:val="000000"/>
                 <w:sz w:val="20"/>
@@ -177,24 +474,20 @@
         </w:tc>
         <w:tc>
           <w:tcPr>
-            <w:tcW w:type="dxa" w:w="3528"/>
+            <w:tcW w:type="dxa" w:w="3855"/>
             <w:vAlign w:val="center"/>
-            <w:tcMar>
-              <w:top w:w="85" w:type="dxa"/>
-              <w:bottom w:w="85" w:type="dxa"/>
-              <w:left w:w="110" w:type="dxa"/>
-              <w:right w:w="110" w:type="dxa"/>
-            </w:tcMar>
-            <w:shd w:fill="F1F2F3"/>
+            <w:shd w:fill="F0F1F2" w:val="clear"/>
           </w:tcPr>
           <w:p>
             <w:pPr>
-              <w:spacing w:after="0" w:line="280" w:lineRule="auto" w:before="0"/>
+              <w:keepNext w:val="0"/>
+              <w:spacing w:after="0" w:line="276" w:lineRule="auto"/>
+              <w:snapToGrid w:val="0"/>
               <w:jc w:val="center"/>
-              <w:snapToGrid w:val="0"/>
             </w:pPr>
             <w:r>
               <w:rPr>
+                <w:rFonts w:ascii="Nanum Gothic" w:hAnsi="Nanum Gothic" w:eastAsia="Nanum Gothic" w:cs="Nanum Gothic"/>
                 <w:b/>
                 <w:color w:val="000000"/>
                 <w:sz w:val="20"/>
@@ -205,52 +498,44 @@
         </w:tc>
         <w:tc>
           <w:tcPr>
-            <w:tcW w:type="dxa" w:w="2088"/>
+            <w:tcW w:type="dxa" w:w="2721"/>
             <w:vAlign w:val="center"/>
-            <w:tcMar>
-              <w:top w:w="85" w:type="dxa"/>
-              <w:bottom w:w="85" w:type="dxa"/>
-              <w:left w:w="110" w:type="dxa"/>
-              <w:right w:w="110" w:type="dxa"/>
-            </w:tcMar>
-            <w:shd w:fill="F1F2F3"/>
+            <w:shd w:fill="F0F1F2" w:val="clear"/>
           </w:tcPr>
           <w:p>
             <w:pPr>
-              <w:spacing w:after="0" w:line="280" w:lineRule="auto" w:before="0"/>
+              <w:keepNext w:val="0"/>
+              <w:spacing w:after="0" w:line="276" w:lineRule="auto"/>
+              <w:snapToGrid w:val="0"/>
               <w:jc w:val="center"/>
-              <w:snapToGrid w:val="0"/>
             </w:pPr>
             <w:r>
               <w:rPr>
+                <w:rFonts w:ascii="Nanum Gothic" w:hAnsi="Nanum Gothic" w:eastAsia="Nanum Gothic" w:cs="Nanum Gothic"/>
                 <w:b/>
                 <w:color w:val="000000"/>
                 <w:sz w:val="20"/>
               </w:rPr>
-              <w:t>학위 및 상태</w:t>
+              <w:t>학위 및 졸업 구분</w:t>
             </w:r>
           </w:p>
         </w:tc>
         <w:tc>
           <w:tcPr>
-            <w:tcW w:type="dxa" w:w="2606"/>
+            <w:tcW w:type="dxa" w:w="1531"/>
             <w:vAlign w:val="center"/>
-            <w:tcMar>
-              <w:top w:w="85" w:type="dxa"/>
-              <w:bottom w:w="85" w:type="dxa"/>
-              <w:left w:w="110" w:type="dxa"/>
-              <w:right w:w="110" w:type="dxa"/>
-            </w:tcMar>
-            <w:shd w:fill="F1F2F3"/>
+            <w:shd w:fill="F0F1F2" w:val="clear"/>
           </w:tcPr>
           <w:p>
             <w:pPr>
-              <w:spacing w:after="0" w:line="280" w:lineRule="auto" w:before="0"/>
+              <w:keepNext w:val="0"/>
+              <w:spacing w:after="0" w:line="276" w:lineRule="auto"/>
+              <w:snapToGrid w:val="0"/>
               <w:jc w:val="center"/>
-              <w:snapToGrid w:val="0"/>
             </w:pPr>
             <w:r>
               <w:rPr>
+                <w:rFonts w:ascii="Nanum Gothic" w:hAnsi="Nanum Gothic" w:eastAsia="Nanum Gothic" w:cs="Nanum Gothic"/>
                 <w:b/>
                 <w:color w:val="000000"/>
                 <w:sz w:val="20"/>
@@ -266,54 +551,45 @@
         </w:trPr>
         <w:tc>
           <w:tcPr>
-            <w:tcW w:type="dxa" w:w="1944"/>
+            <w:tcW w:type="dxa" w:w="1757"/>
             <w:vAlign w:val="center"/>
-            <w:tcMar>
-              <w:top w:w="85" w:type="dxa"/>
-              <w:bottom w:w="85" w:type="dxa"/>
-              <w:left w:w="110" w:type="dxa"/>
-              <w:right w:w="110" w:type="dxa"/>
-            </w:tcMar>
           </w:tcPr>
           <w:p>
             <w:pPr>
-              <w:spacing w:after="0" w:line="280" w:lineRule="auto" w:before="0"/>
+              <w:keepNext w:val="0"/>
+              <w:spacing w:after="0" w:line="276" w:lineRule="auto"/>
+              <w:snapToGrid w:val="0"/>
               <w:jc w:val="center"/>
-              <w:snapToGrid w:val="0"/>
             </w:pPr>
             <w:r>
               <w:rPr>
-                <w:sz w:val="21"/>
+                <w:rFonts w:ascii="Nanum Gothic" w:hAnsi="Nanum Gothic" w:eastAsia="Nanum Gothic" w:cs="Nanum Gothic"/>
+                <w:b w:val="0"/>
                 <w:color w:val="000000"/>
-                <w:b w:val="0"/>
+                <w:sz w:val="20"/>
               </w:rPr>
-              <w:t>[시작일]</w:t>
-              <w:br/>
-              <w:t>- [졸업일]</w:t>
+              <w:t>[입학] - [졸업]</w:t>
             </w:r>
           </w:p>
         </w:tc>
         <w:tc>
           <w:tcPr>
-            <w:tcW w:type="dxa" w:w="3528"/>
+            <w:tcW w:type="dxa" w:w="3855"/>
             <w:vAlign w:val="center"/>
-            <w:tcMar>
-              <w:top w:w="85" w:type="dxa"/>
-              <w:bottom w:w="85" w:type="dxa"/>
-              <w:left w:w="110" w:type="dxa"/>
-              <w:right w:w="110" w:type="dxa"/>
-            </w:tcMar>
           </w:tcPr>
           <w:p>
             <w:pPr>
-              <w:spacing w:after="0" w:line="280" w:lineRule="auto" w:before="0"/>
+              <w:keepNext w:val="0"/>
+              <w:spacing w:after="0" w:line="276" w:lineRule="auto"/>
               <w:snapToGrid w:val="0"/>
+              <w:jc w:val="left"/>
             </w:pPr>
             <w:r>
               <w:rPr>
+                <w:rFonts w:ascii="Nanum Gothic" w:hAnsi="Nanum Gothic" w:eastAsia="Nanum Gothic" w:cs="Nanum Gothic"/>
                 <w:b w:val="0"/>
-                <w:color w:val="595959"/>
-                <w:sz w:val="21"/>
+                <w:color w:val="000000"/>
+                <w:sz w:val="20"/>
               </w:rPr>
               <w:t>[학교명]</w:t>
               <w:br/>
@@ -323,53 +599,45 @@
         </w:tc>
         <w:tc>
           <w:tcPr>
-            <w:tcW w:type="dxa" w:w="2088"/>
+            <w:tcW w:type="dxa" w:w="2721"/>
             <w:vAlign w:val="center"/>
-            <w:tcMar>
-              <w:top w:w="85" w:type="dxa"/>
-              <w:bottom w:w="85" w:type="dxa"/>
-              <w:left w:w="110" w:type="dxa"/>
-              <w:right w:w="110" w:type="dxa"/>
-            </w:tcMar>
           </w:tcPr>
           <w:p>
             <w:pPr>
-              <w:spacing w:after="0" w:line="280" w:lineRule="auto" w:before="0"/>
+              <w:keepNext w:val="0"/>
+              <w:spacing w:after="0" w:line="276" w:lineRule="auto"/>
               <w:snapToGrid w:val="0"/>
+              <w:jc w:val="center"/>
             </w:pPr>
             <w:r>
               <w:rPr>
+                <w:rFonts w:ascii="Nanum Gothic" w:hAnsi="Nanum Gothic" w:eastAsia="Nanum Gothic" w:cs="Nanum Gothic"/>
                 <w:b w:val="0"/>
-                <w:color w:val="595959"/>
-                <w:sz w:val="21"/>
+                <w:color w:val="000000"/>
+                <w:sz w:val="20"/>
               </w:rPr>
-              <w:t>[학위]</w:t>
-              <w:br/>
-              <w:t>[졸업 또는 예정]</w:t>
+              <w:t>[학위 / 졸업 구분]</w:t>
             </w:r>
           </w:p>
         </w:tc>
         <w:tc>
           <w:tcPr>
-            <w:tcW w:type="dxa" w:w="2606"/>
+            <w:tcW w:type="dxa" w:w="1531"/>
             <w:vAlign w:val="center"/>
-            <w:tcMar>
-              <w:top w:w="85" w:type="dxa"/>
-              <w:bottom w:w="85" w:type="dxa"/>
-              <w:left w:w="110" w:type="dxa"/>
-              <w:right w:w="110" w:type="dxa"/>
-            </w:tcMar>
           </w:tcPr>
           <w:p>
             <w:pPr>
-              <w:spacing w:after="0" w:line="280" w:lineRule="auto" w:before="0"/>
+              <w:keepNext w:val="0"/>
+              <w:spacing w:after="0" w:line="276" w:lineRule="auto"/>
               <w:snapToGrid w:val="0"/>
+              <w:jc w:val="center"/>
             </w:pPr>
             <w:r>
               <w:rPr>
+                <w:rFonts w:ascii="Nanum Gothic" w:hAnsi="Nanum Gothic" w:eastAsia="Nanum Gothic" w:cs="Nanum Gothic"/>
                 <w:b w:val="0"/>
-                <w:color w:val="595959"/>
-                <w:sz w:val="21"/>
+                <w:color w:val="000000"/>
+                <w:sz w:val="20"/>
               </w:rPr>
               <w:t>[취득 / 만점]</w:t>
             </w:r>
@@ -381,32 +649,46 @@
       <w:pPr>
         <w:pStyle w:val="Heading1"/>
       </w:pPr>
-      <w:bookmarkStart w:id="506" w:name="findar_work_heading"/>
+      <w:bookmarkStart w:id="106" w:name="findar_work_heading"/>
       <w:r>
-        <w:t>경력</w:t>
+        <w:rPr>
+          <w:rFonts w:ascii="Nanum Gothic" w:hAnsi="Nanum Gothic" w:eastAsia="Nanum Gothic" w:cs="Nanum Gothic"/>
+          <w:b/>
+          <w:color w:val="000000"/>
+          <w:sz w:val="22"/>
+        </w:rPr>
+        <w:t>3. 경력사항</w:t>
       </w:r>
-      <w:bookmarkEnd w:id="506"/>
+      <w:bookmarkEnd w:id="106"/>
     </w:p>
     <w:tbl>
       <w:tblPr>
-        <w:tblW w:type="auto" w:w="0"/>
+        <w:tblW w:type="dxa" w:w="9865"/>
         <w:jc w:val="center"/>
         <w:tblLayout w:type="fixed"/>
         <w:tblLook w:firstColumn="1" w:firstRow="1" w:lastColumn="0" w:lastRow="0" w:noHBand="0" w:noVBand="1" w:val="04A0"/>
+        <w:tblInd w:w="0" w:type="dxa"/>
         <w:tblBorders>
-          <w:top w:val="single" w:sz="4" w:color="D9D9D9"/>
-          <w:left w:val="single" w:sz="4" w:color="D9D9D9"/>
-          <w:bottom w:val="single" w:sz="4" w:color="D9D9D9"/>
-          <w:right w:val="single" w:sz="4" w:color="D9D9D9"/>
-          <w:insideH w:val="single" w:sz="4" w:color="D9D9D9"/>
-          <w:insideV w:val="single" w:sz="4" w:color="D9D9D9"/>
+          <w:top w:val="single" w:sz="5" w:color="B9BEC4"/>
+          <w:bottom w:val="single" w:sz="5" w:color="B9BEC4"/>
+          <w:left w:val="single" w:sz="5" w:color="B9BEC4"/>
+          <w:right w:val="single" w:sz="5" w:color="B9BEC4"/>
+          <w:insideH w:val="single" w:sz="5" w:color="B9BEC4"/>
+          <w:insideV w:val="single" w:sz="5" w:color="B9BEC4"/>
         </w:tblBorders>
+        <w:tblCellMar>
+          <w:top w:w="60" w:type="dxa"/>
+          <w:bottom w:w="60" w:type="dxa"/>
+          <w:left w:w="100" w:type="dxa"/>
+          <w:right w:w="100" w:type="dxa"/>
+        </w:tblCellMar>
         <w:tblCaption w:val="findar_work_table"/>
       </w:tblPr>
       <w:tblGrid>
-        <w:gridCol w:w="2232"/>
-        <w:gridCol w:w="5126"/>
-        <w:gridCol w:w="2808"/>
+        <w:gridCol w:w="1757"/>
+        <w:gridCol w:w="2721"/>
+        <w:gridCol w:w="1984"/>
+        <w:gridCol w:w="3402"/>
       </w:tblGrid>
       <w:tr>
         <w:trPr>
@@ -415,52 +697,44 @@
         </w:trPr>
         <w:tc>
           <w:tcPr>
-            <w:tcW w:type="dxa" w:w="2232"/>
+            <w:tcW w:type="dxa" w:w="1757"/>
             <w:vAlign w:val="center"/>
-            <w:tcMar>
-              <w:top w:w="85" w:type="dxa"/>
-              <w:bottom w:w="85" w:type="dxa"/>
-              <w:left w:w="110" w:type="dxa"/>
-              <w:right w:w="110" w:type="dxa"/>
-            </w:tcMar>
-            <w:shd w:fill="F1F2F3"/>
+            <w:shd w:fill="F0F1F2" w:val="clear"/>
           </w:tcPr>
           <w:p>
             <w:pPr>
-              <w:spacing w:after="0" w:line="280" w:lineRule="auto" w:before="0"/>
+              <w:keepNext w:val="0"/>
+              <w:spacing w:after="0" w:line="276" w:lineRule="auto"/>
+              <w:snapToGrid w:val="0"/>
               <w:jc w:val="center"/>
-              <w:snapToGrid w:val="0"/>
             </w:pPr>
             <w:r>
               <w:rPr>
+                <w:rFonts w:ascii="Nanum Gothic" w:hAnsi="Nanum Gothic" w:eastAsia="Nanum Gothic" w:cs="Nanum Gothic"/>
                 <w:b/>
                 <w:color w:val="000000"/>
                 <w:sz w:val="20"/>
               </w:rPr>
-              <w:t>재직 기간</w:t>
+              <w:t>근무 기간</w:t>
             </w:r>
           </w:p>
         </w:tc>
         <w:tc>
           <w:tcPr>
-            <w:tcW w:type="dxa" w:w="5126"/>
+            <w:tcW w:type="dxa" w:w="2721"/>
             <w:vAlign w:val="center"/>
-            <w:tcMar>
-              <w:top w:w="85" w:type="dxa"/>
-              <w:bottom w:w="85" w:type="dxa"/>
-              <w:left w:w="110" w:type="dxa"/>
-              <w:right w:w="110" w:type="dxa"/>
-            </w:tcMar>
-            <w:shd w:fill="F1F2F3"/>
+            <w:shd w:fill="F0F1F2" w:val="clear"/>
           </w:tcPr>
           <w:p>
             <w:pPr>
-              <w:spacing w:after="0" w:line="280" w:lineRule="auto" w:before="0"/>
+              <w:keepNext w:val="0"/>
+              <w:spacing w:after="0" w:line="276" w:lineRule="auto"/>
+              <w:snapToGrid w:val="0"/>
               <w:jc w:val="center"/>
-              <w:snapToGrid w:val="0"/>
             </w:pPr>
             <w:r>
               <w:rPr>
+                <w:rFonts w:ascii="Nanum Gothic" w:hAnsi="Nanum Gothic" w:eastAsia="Nanum Gothic" w:cs="Nanum Gothic"/>
                 <w:b/>
                 <w:color w:val="000000"/>
                 <w:sz w:val="20"/>
@@ -471,29 +745,49 @@
         </w:tc>
         <w:tc>
           <w:tcPr>
-            <w:tcW w:type="dxa" w:w="2808"/>
+            <w:tcW w:type="dxa" w:w="1984"/>
             <w:vAlign w:val="center"/>
-            <w:tcMar>
-              <w:top w:w="85" w:type="dxa"/>
-              <w:bottom w:w="85" w:type="dxa"/>
-              <w:left w:w="110" w:type="dxa"/>
-              <w:right w:w="110" w:type="dxa"/>
-            </w:tcMar>
-            <w:shd w:fill="F1F2F3"/>
+            <w:shd w:fill="F0F1F2" w:val="clear"/>
           </w:tcPr>
           <w:p>
             <w:pPr>
-              <w:spacing w:after="0" w:line="280" w:lineRule="auto" w:before="0"/>
+              <w:keepNext w:val="0"/>
+              <w:spacing w:after="0" w:line="276" w:lineRule="auto"/>
+              <w:snapToGrid w:val="0"/>
               <w:jc w:val="center"/>
-              <w:snapToGrid w:val="0"/>
             </w:pPr>
             <w:r>
               <w:rPr>
+                <w:rFonts w:ascii="Nanum Gothic" w:hAnsi="Nanum Gothic" w:eastAsia="Nanum Gothic" w:cs="Nanum Gothic"/>
                 <w:b/>
                 <w:color w:val="000000"/>
                 <w:sz w:val="20"/>
               </w:rPr>
               <w:t>직위 및 고용 형태</w:t>
+            </w:r>
+          </w:p>
+        </w:tc>
+        <w:tc>
+          <w:tcPr>
+            <w:tcW w:type="dxa" w:w="3402"/>
+            <w:vAlign w:val="center"/>
+            <w:shd w:fill="F0F1F2" w:val="clear"/>
+          </w:tcPr>
+          <w:p>
+            <w:pPr>
+              <w:keepNext w:val="0"/>
+              <w:spacing w:after="0" w:line="276" w:lineRule="auto"/>
+              <w:snapToGrid w:val="0"/>
+              <w:jc w:val="center"/>
+            </w:pPr>
+            <w:r>
+              <w:rPr>
+                <w:rFonts w:ascii="Nanum Gothic" w:hAnsi="Nanum Gothic" w:eastAsia="Nanum Gothic" w:cs="Nanum Gothic"/>
+                <w:b/>
+                <w:color w:val="000000"/>
+                <w:sz w:val="20"/>
+              </w:rPr>
+              <w:t>담당업무</w:t>
             </w:r>
           </w:p>
         </w:tc>
@@ -504,85 +798,97 @@
         </w:trPr>
         <w:tc>
           <w:tcPr>
-            <w:tcW w:type="dxa" w:w="2232"/>
+            <w:tcW w:type="dxa" w:w="1757"/>
             <w:vAlign w:val="center"/>
-            <w:tcMar>
-              <w:top w:w="85" w:type="dxa"/>
-              <w:bottom w:w="85" w:type="dxa"/>
-              <w:left w:w="110" w:type="dxa"/>
-              <w:right w:w="110" w:type="dxa"/>
-            </w:tcMar>
           </w:tcPr>
           <w:p>
             <w:pPr>
-              <w:spacing w:after="0" w:line="280" w:lineRule="auto" w:before="0"/>
+              <w:keepNext w:val="0"/>
+              <w:spacing w:after="0" w:line="276" w:lineRule="auto"/>
               <w:snapToGrid w:val="0"/>
+              <w:jc w:val="center"/>
             </w:pPr>
             <w:r>
               <w:rPr>
-                <w:sz w:val="21"/>
+                <w:rFonts w:ascii="Nanum Gothic" w:hAnsi="Nanum Gothic" w:eastAsia="Nanum Gothic" w:cs="Nanum Gothic"/>
+                <w:b w:val="0"/>
                 <w:color w:val="000000"/>
-                <w:b w:val="0"/>
+                <w:sz w:val="20"/>
               </w:rPr>
-              <w:t>[시작일]</w:t>
-              <w:br/>
-              <w:t>- [종료일 또는 현재]</w:t>
+              <w:t>[입사] - [퇴사]</w:t>
             </w:r>
           </w:p>
         </w:tc>
         <w:tc>
           <w:tcPr>
-            <w:tcW w:type="dxa" w:w="5126"/>
+            <w:tcW w:type="dxa" w:w="2721"/>
             <w:vAlign w:val="center"/>
-            <w:tcMar>
-              <w:top w:w="85" w:type="dxa"/>
-              <w:bottom w:w="85" w:type="dxa"/>
-              <w:left w:w="110" w:type="dxa"/>
-              <w:right w:w="110" w:type="dxa"/>
-            </w:tcMar>
           </w:tcPr>
           <w:p>
             <w:pPr>
-              <w:spacing w:after="0" w:line="280" w:lineRule="auto" w:before="0"/>
+              <w:keepNext w:val="0"/>
+              <w:spacing w:after="0" w:line="276" w:lineRule="auto"/>
               <w:snapToGrid w:val="0"/>
+              <w:jc w:val="left"/>
             </w:pPr>
             <w:r>
               <w:rPr>
+                <w:rFonts w:ascii="Nanum Gothic" w:hAnsi="Nanum Gothic" w:eastAsia="Nanum Gothic" w:cs="Nanum Gothic"/>
                 <w:b w:val="0"/>
-                <w:color w:val="595959"/>
-                <w:sz w:val="21"/>
+                <w:color w:val="000000"/>
+                <w:sz w:val="20"/>
               </w:rPr>
-              <w:t>[회사명 / 부서명]</w:t>
+              <w:t>[회사명]</w:t>
               <w:br/>
-              <w:t>[담당 업무 한 줄 요약]</w:t>
+              <w:t>[부서명]</w:t>
             </w:r>
           </w:p>
         </w:tc>
         <w:tc>
           <w:tcPr>
-            <w:tcW w:type="dxa" w:w="2808"/>
+            <w:tcW w:type="dxa" w:w="1984"/>
             <w:vAlign w:val="center"/>
-            <w:tcMar>
-              <w:top w:w="85" w:type="dxa"/>
-              <w:bottom w:w="85" w:type="dxa"/>
-              <w:left w:w="110" w:type="dxa"/>
-              <w:right w:w="110" w:type="dxa"/>
-            </w:tcMar>
           </w:tcPr>
           <w:p>
             <w:pPr>
-              <w:spacing w:after="0" w:line="280" w:lineRule="auto" w:before="0"/>
+              <w:keepNext w:val="0"/>
+              <w:spacing w:after="0" w:line="276" w:lineRule="auto"/>
               <w:snapToGrid w:val="0"/>
+              <w:jc w:val="center"/>
             </w:pPr>
             <w:r>
               <w:rPr>
+                <w:rFonts w:ascii="Nanum Gothic" w:hAnsi="Nanum Gothic" w:eastAsia="Nanum Gothic" w:cs="Nanum Gothic"/>
                 <w:b w:val="0"/>
-                <w:color w:val="595959"/>
-                <w:sz w:val="21"/>
+                <w:color w:val="000000"/>
+                <w:sz w:val="20"/>
               </w:rPr>
               <w:t>[직위]</w:t>
               <w:br/>
               <w:t>[고용 형태]</w:t>
+            </w:r>
+          </w:p>
+        </w:tc>
+        <w:tc>
+          <w:tcPr>
+            <w:tcW w:type="dxa" w:w="3402"/>
+            <w:vAlign w:val="center"/>
+          </w:tcPr>
+          <w:p>
+            <w:pPr>
+              <w:keepNext w:val="0"/>
+              <w:spacing w:after="0" w:line="276" w:lineRule="auto"/>
+              <w:snapToGrid w:val="0"/>
+              <w:jc w:val="left"/>
+            </w:pPr>
+            <w:r>
+              <w:rPr>
+                <w:rFonts w:ascii="Nanum Gothic" w:hAnsi="Nanum Gothic" w:eastAsia="Nanum Gothic" w:cs="Nanum Gothic"/>
+                <w:b w:val="0"/>
+                <w:color w:val="000000"/>
+                <w:sz w:val="20"/>
+              </w:rPr>
+              <w:t>[담당업무]</w:t>
             </w:r>
           </w:p>
         </w:tc>
@@ -592,34 +898,47 @@
       <w:pPr>
         <w:pStyle w:val="Heading1"/>
       </w:pPr>
-      <w:bookmarkStart w:id="508" w:name="findar_credentials_heading"/>
+      <w:bookmarkStart w:id="108" w:name="findar_credentials_heading"/>
       <w:r>
-        <w:t>자격 및 어학</w:t>
+        <w:rPr>
+          <w:rFonts w:ascii="Nanum Gothic" w:hAnsi="Nanum Gothic" w:eastAsia="Nanum Gothic" w:cs="Nanum Gothic"/>
+          <w:b/>
+          <w:color w:val="000000"/>
+          <w:sz w:val="22"/>
+        </w:rPr>
+        <w:t>4. 자격 및 어학</w:t>
       </w:r>
-      <w:bookmarkEnd w:id="508"/>
+      <w:bookmarkEnd w:id="108"/>
     </w:p>
     <w:tbl>
       <w:tblPr>
-        <w:tblW w:type="auto" w:w="0"/>
+        <w:tblW w:type="dxa" w:w="9865"/>
         <w:jc w:val="center"/>
         <w:tblLayout w:type="fixed"/>
         <w:tblLook w:firstColumn="1" w:firstRow="1" w:lastColumn="0" w:lastRow="0" w:noHBand="0" w:noVBand="1" w:val="04A0"/>
+        <w:tblInd w:w="0" w:type="dxa"/>
         <w:tblBorders>
-          <w:top w:val="single" w:sz="4" w:color="D9D9D9"/>
-          <w:left w:val="single" w:sz="4" w:color="D9D9D9"/>
-          <w:bottom w:val="single" w:sz="4" w:color="D9D9D9"/>
-          <w:right w:val="single" w:sz="4" w:color="D9D9D9"/>
-          <w:insideH w:val="single" w:sz="4" w:color="D9D9D9"/>
-          <w:insideV w:val="single" w:sz="4" w:color="D9D9D9"/>
+          <w:top w:val="single" w:sz="5" w:color="B9BEC4"/>
+          <w:bottom w:val="single" w:sz="5" w:color="B9BEC4"/>
+          <w:left w:val="single" w:sz="5" w:color="B9BEC4"/>
+          <w:right w:val="single" w:sz="5" w:color="B9BEC4"/>
+          <w:insideH w:val="single" w:sz="5" w:color="B9BEC4"/>
+          <w:insideV w:val="single" w:sz="5" w:color="B9BEC4"/>
         </w:tblBorders>
+        <w:tblCellMar>
+          <w:top w:w="60" w:type="dxa"/>
+          <w:bottom w:w="60" w:type="dxa"/>
+          <w:left w:w="100" w:type="dxa"/>
+          <w:right w:w="100" w:type="dxa"/>
+        </w:tblCellMar>
         <w:tblCaption w:val="findar_credentials_table"/>
       </w:tblPr>
       <w:tblGrid>
-        <w:gridCol w:w="893"/>
-        <w:gridCol w:w="2952"/>
-        <w:gridCol w:w="2520"/>
-        <w:gridCol w:w="1642"/>
-        <w:gridCol w:w="2160"/>
+        <w:gridCol w:w="850"/>
+        <w:gridCol w:w="2778"/>
+        <w:gridCol w:w="2665"/>
+        <w:gridCol w:w="1757"/>
+        <w:gridCol w:w="1814"/>
       </w:tblGrid>
       <w:tr>
         <w:trPr>
@@ -628,24 +947,20 @@
         </w:trPr>
         <w:tc>
           <w:tcPr>
-            <w:tcW w:type="dxa" w:w="893"/>
+            <w:tcW w:type="dxa" w:w="850"/>
             <w:vAlign w:val="center"/>
-            <w:tcMar>
-              <w:top w:w="85" w:type="dxa"/>
-              <w:bottom w:w="85" w:type="dxa"/>
-              <w:left w:w="110" w:type="dxa"/>
-              <w:right w:w="110" w:type="dxa"/>
-            </w:tcMar>
-            <w:shd w:fill="F1F2F3"/>
+            <w:shd w:fill="F0F1F2" w:val="clear"/>
           </w:tcPr>
           <w:p>
             <w:pPr>
-              <w:spacing w:after="0" w:line="280" w:lineRule="auto" w:before="0"/>
+              <w:keepNext w:val="0"/>
+              <w:spacing w:after="0" w:line="276" w:lineRule="auto"/>
+              <w:snapToGrid w:val="0"/>
               <w:jc w:val="center"/>
-              <w:snapToGrid w:val="0"/>
             </w:pPr>
             <w:r>
               <w:rPr>
+                <w:rFonts w:ascii="Nanum Gothic" w:hAnsi="Nanum Gothic" w:eastAsia="Nanum Gothic" w:cs="Nanum Gothic"/>
                 <w:b/>
                 <w:color w:val="000000"/>
                 <w:sz w:val="20"/>
@@ -656,52 +971,44 @@
         </w:tc>
         <w:tc>
           <w:tcPr>
-            <w:tcW w:type="dxa" w:w="2952"/>
+            <w:tcW w:type="dxa" w:w="2778"/>
             <w:vAlign w:val="center"/>
-            <w:tcMar>
-              <w:top w:w="85" w:type="dxa"/>
-              <w:bottom w:w="85" w:type="dxa"/>
-              <w:left w:w="110" w:type="dxa"/>
-              <w:right w:w="110" w:type="dxa"/>
-            </w:tcMar>
-            <w:shd w:fill="F1F2F3"/>
+            <w:shd w:fill="F0F1F2" w:val="clear"/>
           </w:tcPr>
           <w:p>
             <w:pPr>
-              <w:spacing w:after="0" w:line="280" w:lineRule="auto" w:before="0"/>
+              <w:keepNext w:val="0"/>
+              <w:spacing w:after="0" w:line="276" w:lineRule="auto"/>
+              <w:snapToGrid w:val="0"/>
               <w:jc w:val="center"/>
-              <w:snapToGrid w:val="0"/>
             </w:pPr>
             <w:r>
               <w:rPr>
+                <w:rFonts w:ascii="Nanum Gothic" w:hAnsi="Nanum Gothic" w:eastAsia="Nanum Gothic" w:cs="Nanum Gothic"/>
                 <w:b/>
                 <w:color w:val="000000"/>
                 <w:sz w:val="20"/>
               </w:rPr>
-              <w:t>자격명 또는 시험명</w:t>
+              <w:t>자격 및 시험명</w:t>
             </w:r>
           </w:p>
         </w:tc>
         <w:tc>
           <w:tcPr>
-            <w:tcW w:type="dxa" w:w="2520"/>
+            <w:tcW w:type="dxa" w:w="2665"/>
             <w:vAlign w:val="center"/>
-            <w:tcMar>
-              <w:top w:w="85" w:type="dxa"/>
-              <w:bottom w:w="85" w:type="dxa"/>
-              <w:left w:w="110" w:type="dxa"/>
-              <w:right w:w="110" w:type="dxa"/>
-            </w:tcMar>
-            <w:shd w:fill="F1F2F3"/>
+            <w:shd w:fill="F0F1F2" w:val="clear"/>
           </w:tcPr>
           <w:p>
             <w:pPr>
-              <w:spacing w:after="0" w:line="280" w:lineRule="auto" w:before="0"/>
+              <w:keepNext w:val="0"/>
+              <w:spacing w:after="0" w:line="276" w:lineRule="auto"/>
+              <w:snapToGrid w:val="0"/>
               <w:jc w:val="center"/>
-              <w:snapToGrid w:val="0"/>
             </w:pPr>
             <w:r>
               <w:rPr>
+                <w:rFonts w:ascii="Nanum Gothic" w:hAnsi="Nanum Gothic" w:eastAsia="Nanum Gothic" w:cs="Nanum Gothic"/>
                 <w:b/>
                 <w:color w:val="000000"/>
                 <w:sz w:val="20"/>
@@ -712,24 +1019,20 @@
         </w:tc>
         <w:tc>
           <w:tcPr>
-            <w:tcW w:type="dxa" w:w="1642"/>
+            <w:tcW w:type="dxa" w:w="1757"/>
             <w:vAlign w:val="center"/>
-            <w:tcMar>
-              <w:top w:w="85" w:type="dxa"/>
-              <w:bottom w:w="85" w:type="dxa"/>
-              <w:left w:w="110" w:type="dxa"/>
-              <w:right w:w="110" w:type="dxa"/>
-            </w:tcMar>
-            <w:shd w:fill="F1F2F3"/>
+            <w:shd w:fill="F0F1F2" w:val="clear"/>
           </w:tcPr>
           <w:p>
             <w:pPr>
-              <w:spacing w:after="0" w:line="280" w:lineRule="auto" w:before="0"/>
+              <w:keepNext w:val="0"/>
+              <w:spacing w:after="0" w:line="276" w:lineRule="auto"/>
+              <w:snapToGrid w:val="0"/>
               <w:jc w:val="center"/>
-              <w:snapToGrid w:val="0"/>
             </w:pPr>
             <w:r>
               <w:rPr>
+                <w:rFonts w:ascii="Nanum Gothic" w:hAnsi="Nanum Gothic" w:eastAsia="Nanum Gothic" w:cs="Nanum Gothic"/>
                 <w:b/>
                 <w:color w:val="000000"/>
                 <w:sz w:val="20"/>
@@ -740,24 +1043,20 @@
         </w:tc>
         <w:tc>
           <w:tcPr>
-            <w:tcW w:type="dxa" w:w="2160"/>
+            <w:tcW w:type="dxa" w:w="1814"/>
             <w:vAlign w:val="center"/>
-            <w:tcMar>
-              <w:top w:w="85" w:type="dxa"/>
-              <w:bottom w:w="85" w:type="dxa"/>
-              <w:left w:w="110" w:type="dxa"/>
-              <w:right w:w="110" w:type="dxa"/>
-            </w:tcMar>
-            <w:shd w:fill="F1F2F3"/>
+            <w:shd w:fill="F0F1F2" w:val="clear"/>
           </w:tcPr>
           <w:p>
             <w:pPr>
-              <w:spacing w:after="0" w:line="280" w:lineRule="auto" w:before="0"/>
+              <w:keepNext w:val="0"/>
+              <w:spacing w:after="0" w:line="276" w:lineRule="auto"/>
+              <w:snapToGrid w:val="0"/>
               <w:jc w:val="center"/>
-              <w:snapToGrid w:val="0"/>
             </w:pPr>
             <w:r>
               <w:rPr>
+                <w:rFonts w:ascii="Nanum Gothic" w:hAnsi="Nanum Gothic" w:eastAsia="Nanum Gothic" w:cs="Nanum Gothic"/>
                 <w:b/>
                 <w:color w:val="000000"/>
                 <w:sz w:val="20"/>
@@ -773,26 +1072,22 @@
         </w:trPr>
         <w:tc>
           <w:tcPr>
-            <w:tcW w:type="dxa" w:w="893"/>
+            <w:tcW w:type="dxa" w:w="850"/>
             <w:vAlign w:val="center"/>
-            <w:tcMar>
-              <w:top w:w="85" w:type="dxa"/>
-              <w:bottom w:w="85" w:type="dxa"/>
-              <w:left w:w="110" w:type="dxa"/>
-              <w:right w:w="110" w:type="dxa"/>
-            </w:tcMar>
           </w:tcPr>
           <w:p>
             <w:pPr>
-              <w:spacing w:after="0" w:line="280" w:lineRule="auto" w:before="0"/>
+              <w:keepNext w:val="0"/>
+              <w:spacing w:after="0" w:line="276" w:lineRule="auto"/>
+              <w:snapToGrid w:val="0"/>
               <w:jc w:val="center"/>
-              <w:snapToGrid w:val="0"/>
             </w:pPr>
             <w:r>
               <w:rPr>
+                <w:rFonts w:ascii="Nanum Gothic" w:hAnsi="Nanum Gothic" w:eastAsia="Nanum Gothic" w:cs="Nanum Gothic"/>
                 <w:b w:val="0"/>
-                <w:color w:val="595959"/>
-                <w:sz w:val="21"/>
+                <w:color w:val="000000"/>
+                <w:sz w:val="20"/>
               </w:rPr>
               <w:t>자격</w:t>
             </w:r>
@@ -800,25 +1095,22 @@
         </w:tc>
         <w:tc>
           <w:tcPr>
-            <w:tcW w:type="dxa" w:w="2952"/>
+            <w:tcW w:type="dxa" w:w="2778"/>
             <w:vAlign w:val="center"/>
-            <w:tcMar>
-              <w:top w:w="85" w:type="dxa"/>
-              <w:bottom w:w="85" w:type="dxa"/>
-              <w:left w:w="110" w:type="dxa"/>
-              <w:right w:w="110" w:type="dxa"/>
-            </w:tcMar>
           </w:tcPr>
           <w:p>
             <w:pPr>
-              <w:spacing w:after="0" w:line="280" w:lineRule="auto" w:before="0"/>
+              <w:keepNext w:val="0"/>
+              <w:spacing w:after="0" w:line="276" w:lineRule="auto"/>
               <w:snapToGrid w:val="0"/>
+              <w:jc w:val="left"/>
             </w:pPr>
             <w:r>
               <w:rPr>
+                <w:rFonts w:ascii="Nanum Gothic" w:hAnsi="Nanum Gothic" w:eastAsia="Nanum Gothic" w:cs="Nanum Gothic"/>
                 <w:b w:val="0"/>
-                <w:color w:val="595959"/>
-                <w:sz w:val="21"/>
+                <w:color w:val="000000"/>
+                <w:sz w:val="20"/>
               </w:rPr>
               <w:t>[자격명]</w:t>
             </w:r>
@@ -826,80 +1118,70 @@
         </w:tc>
         <w:tc>
           <w:tcPr>
-            <w:tcW w:type="dxa" w:w="2520"/>
+            <w:tcW w:type="dxa" w:w="2665"/>
             <w:vAlign w:val="center"/>
-            <w:tcMar>
-              <w:top w:w="85" w:type="dxa"/>
-              <w:bottom w:w="85" w:type="dxa"/>
-              <w:left w:w="110" w:type="dxa"/>
-              <w:right w:w="110" w:type="dxa"/>
-            </w:tcMar>
           </w:tcPr>
           <w:p>
             <w:pPr>
-              <w:spacing w:after="0" w:line="280" w:lineRule="auto" w:before="0"/>
+              <w:keepNext w:val="0"/>
+              <w:spacing w:after="0" w:line="276" w:lineRule="auto"/>
               <w:snapToGrid w:val="0"/>
+              <w:jc w:val="left"/>
             </w:pPr>
             <w:r>
               <w:rPr>
+                <w:rFonts w:ascii="Nanum Gothic" w:hAnsi="Nanum Gothic" w:eastAsia="Nanum Gothic" w:cs="Nanum Gothic"/>
                 <w:b w:val="0"/>
-                <w:color w:val="595959"/>
-                <w:sz w:val="21"/>
+                <w:color w:val="000000"/>
+                <w:sz w:val="20"/>
               </w:rPr>
-              <w:t>[기관명]</w:t>
+              <w:t>[발급 기관]</w:t>
             </w:r>
           </w:p>
         </w:tc>
         <w:tc>
           <w:tcPr>
-            <w:tcW w:type="dxa" w:w="1642"/>
+            <w:tcW w:type="dxa" w:w="1757"/>
             <w:vAlign w:val="center"/>
-            <w:tcMar>
-              <w:top w:w="85" w:type="dxa"/>
-              <w:bottom w:w="85" w:type="dxa"/>
-              <w:left w:w="110" w:type="dxa"/>
-              <w:right w:w="110" w:type="dxa"/>
-            </w:tcMar>
           </w:tcPr>
           <w:p>
             <w:pPr>
-              <w:spacing w:after="0" w:line="280" w:lineRule="auto" w:before="0"/>
+              <w:keepNext w:val="0"/>
+              <w:spacing w:after="0" w:line="276" w:lineRule="auto"/>
+              <w:snapToGrid w:val="0"/>
               <w:jc w:val="center"/>
-              <w:snapToGrid w:val="0"/>
             </w:pPr>
             <w:r>
               <w:rPr>
+                <w:rFonts w:ascii="Nanum Gothic" w:hAnsi="Nanum Gothic" w:eastAsia="Nanum Gothic" w:cs="Nanum Gothic"/>
                 <w:b w:val="0"/>
-                <w:color w:val="595959"/>
-                <w:sz w:val="21"/>
+                <w:color w:val="000000"/>
+                <w:sz w:val="20"/>
               </w:rPr>
-              <w:t>[YYYY.MM]</w:t>
+              <w:t>[취득일]</w:t>
             </w:r>
           </w:p>
         </w:tc>
         <w:tc>
           <w:tcPr>
-            <w:tcW w:type="dxa" w:w="2160"/>
+            <w:tcW w:type="dxa" w:w="1814"/>
             <w:vAlign w:val="center"/>
-            <w:tcMar>
-              <w:top w:w="85" w:type="dxa"/>
-              <w:bottom w:w="85" w:type="dxa"/>
-              <w:left w:w="110" w:type="dxa"/>
-              <w:right w:w="110" w:type="dxa"/>
-            </w:tcMar>
           </w:tcPr>
           <w:p>
             <w:pPr>
-              <w:spacing w:after="0" w:line="280" w:lineRule="auto" w:before="0"/>
+              <w:keepNext w:val="0"/>
+              <w:spacing w:after="0" w:line="276" w:lineRule="auto"/>
               <w:snapToGrid w:val="0"/>
+              <w:jc w:val="center"/>
             </w:pPr>
             <w:r>
               <w:rPr>
+                <w:rFonts w:ascii="Nanum Gothic" w:hAnsi="Nanum Gothic" w:eastAsia="Nanum Gothic" w:cs="Nanum Gothic"/>
                 <w:b w:val="0"/>
-                <w:color w:val="595959"/>
-                <w:sz w:val="21"/>
+                <w:color w:val="000000"/>
+                <w:sz w:val="20"/>
               </w:rPr>
-              <w:t>[등급 또는 합격]</w:t>
+              <w:t>[등급]</w:t>
             </w:r>
           </w:p>
         </w:tc>
@@ -910,26 +1192,22 @@
         </w:trPr>
         <w:tc>
           <w:tcPr>
-            <w:tcW w:type="dxa" w:w="893"/>
+            <w:tcW w:type="dxa" w:w="850"/>
             <w:vAlign w:val="center"/>
-            <w:tcMar>
-              <w:top w:w="85" w:type="dxa"/>
-              <w:bottom w:w="85" w:type="dxa"/>
-              <w:left w:w="110" w:type="dxa"/>
-              <w:right w:w="110" w:type="dxa"/>
-            </w:tcMar>
           </w:tcPr>
           <w:p>
             <w:pPr>
-              <w:spacing w:after="0" w:line="280" w:lineRule="auto" w:before="0"/>
+              <w:keepNext w:val="0"/>
+              <w:spacing w:after="0" w:line="276" w:lineRule="auto"/>
+              <w:snapToGrid w:val="0"/>
               <w:jc w:val="center"/>
-              <w:snapToGrid w:val="0"/>
             </w:pPr>
             <w:r>
               <w:rPr>
+                <w:rFonts w:ascii="Nanum Gothic" w:hAnsi="Nanum Gothic" w:eastAsia="Nanum Gothic" w:cs="Nanum Gothic"/>
                 <w:b w:val="0"/>
-                <w:color w:val="595959"/>
-                <w:sz w:val="21"/>
+                <w:color w:val="000000"/>
+                <w:sz w:val="20"/>
               </w:rPr>
               <w:t>어학</w:t>
             </w:r>
@@ -937,25 +1215,22 @@
         </w:tc>
         <w:tc>
           <w:tcPr>
-            <w:tcW w:type="dxa" w:w="2952"/>
+            <w:tcW w:type="dxa" w:w="2778"/>
             <w:vAlign w:val="center"/>
-            <w:tcMar>
-              <w:top w:w="85" w:type="dxa"/>
-              <w:bottom w:w="85" w:type="dxa"/>
-              <w:left w:w="110" w:type="dxa"/>
-              <w:right w:w="110" w:type="dxa"/>
-            </w:tcMar>
           </w:tcPr>
           <w:p>
             <w:pPr>
-              <w:spacing w:after="0" w:line="280" w:lineRule="auto" w:before="0"/>
+              <w:keepNext w:val="0"/>
+              <w:spacing w:after="0" w:line="276" w:lineRule="auto"/>
               <w:snapToGrid w:val="0"/>
+              <w:jc w:val="left"/>
             </w:pPr>
             <w:r>
               <w:rPr>
+                <w:rFonts w:ascii="Nanum Gothic" w:hAnsi="Nanum Gothic" w:eastAsia="Nanum Gothic" w:cs="Nanum Gothic"/>
                 <w:b w:val="0"/>
-                <w:color w:val="595959"/>
-                <w:sz w:val="21"/>
+                <w:color w:val="000000"/>
+                <w:sz w:val="20"/>
               </w:rPr>
               <w:t>[시험명]</w:t>
             </w:r>
@@ -963,80 +1238,70 @@
         </w:tc>
         <w:tc>
           <w:tcPr>
-            <w:tcW w:type="dxa" w:w="2520"/>
+            <w:tcW w:type="dxa" w:w="2665"/>
             <w:vAlign w:val="center"/>
-            <w:tcMar>
-              <w:top w:w="85" w:type="dxa"/>
-              <w:bottom w:w="85" w:type="dxa"/>
-              <w:left w:w="110" w:type="dxa"/>
-              <w:right w:w="110" w:type="dxa"/>
-            </w:tcMar>
           </w:tcPr>
           <w:p>
             <w:pPr>
-              <w:spacing w:after="0" w:line="280" w:lineRule="auto" w:before="0"/>
+              <w:keepNext w:val="0"/>
+              <w:spacing w:after="0" w:line="276" w:lineRule="auto"/>
               <w:snapToGrid w:val="0"/>
+              <w:jc w:val="left"/>
             </w:pPr>
             <w:r>
               <w:rPr>
+                <w:rFonts w:ascii="Nanum Gothic" w:hAnsi="Nanum Gothic" w:eastAsia="Nanum Gothic" w:cs="Nanum Gothic"/>
                 <w:b w:val="0"/>
-                <w:color w:val="595959"/>
-                <w:sz w:val="21"/>
+                <w:color w:val="000000"/>
+                <w:sz w:val="20"/>
               </w:rPr>
-              <w:t>[기관명]</w:t>
+              <w:t>[시행 기관]</w:t>
             </w:r>
           </w:p>
         </w:tc>
         <w:tc>
           <w:tcPr>
-            <w:tcW w:type="dxa" w:w="1642"/>
+            <w:tcW w:type="dxa" w:w="1757"/>
             <w:vAlign w:val="center"/>
-            <w:tcMar>
-              <w:top w:w="85" w:type="dxa"/>
-              <w:bottom w:w="85" w:type="dxa"/>
-              <w:left w:w="110" w:type="dxa"/>
-              <w:right w:w="110" w:type="dxa"/>
-            </w:tcMar>
           </w:tcPr>
           <w:p>
             <w:pPr>
-              <w:spacing w:after="0" w:line="280" w:lineRule="auto" w:before="0"/>
+              <w:keepNext w:val="0"/>
+              <w:spacing w:after="0" w:line="276" w:lineRule="auto"/>
+              <w:snapToGrid w:val="0"/>
               <w:jc w:val="center"/>
-              <w:snapToGrid w:val="0"/>
             </w:pPr>
             <w:r>
               <w:rPr>
+                <w:rFonts w:ascii="Nanum Gothic" w:hAnsi="Nanum Gothic" w:eastAsia="Nanum Gothic" w:cs="Nanum Gothic"/>
                 <w:b w:val="0"/>
-                <w:color w:val="595959"/>
-                <w:sz w:val="21"/>
+                <w:color w:val="000000"/>
+                <w:sz w:val="20"/>
               </w:rPr>
-              <w:t>[YYYY.MM]</w:t>
+              <w:t>[응시일]</w:t>
             </w:r>
           </w:p>
         </w:tc>
         <w:tc>
           <w:tcPr>
-            <w:tcW w:type="dxa" w:w="2160"/>
+            <w:tcW w:type="dxa" w:w="1814"/>
             <w:vAlign w:val="center"/>
-            <w:tcMar>
-              <w:top w:w="85" w:type="dxa"/>
-              <w:bottom w:w="85" w:type="dxa"/>
-              <w:left w:w="110" w:type="dxa"/>
-              <w:right w:w="110" w:type="dxa"/>
-            </w:tcMar>
           </w:tcPr>
           <w:p>
             <w:pPr>
-              <w:spacing w:after="0" w:line="280" w:lineRule="auto" w:before="0"/>
+              <w:keepNext w:val="0"/>
+              <w:spacing w:after="0" w:line="276" w:lineRule="auto"/>
               <w:snapToGrid w:val="0"/>
+              <w:jc w:val="center"/>
             </w:pPr>
             <w:r>
               <w:rPr>
+                <w:rFonts w:ascii="Nanum Gothic" w:hAnsi="Nanum Gothic" w:eastAsia="Nanum Gothic" w:cs="Nanum Gothic"/>
                 <w:b w:val="0"/>
-                <w:color w:val="595959"/>
-                <w:sz w:val="21"/>
+                <w:color w:val="000000"/>
+                <w:sz w:val="20"/>
               </w:rPr>
-              <w:t>[점수 또는 등급]</w:t>
+              <w:t>[점수]</w:t>
             </w:r>
           </w:p>
         </w:tc>
@@ -1046,506 +1311,515 @@
       <w:pPr>
         <w:pStyle w:val="Heading1"/>
       </w:pPr>
-      <w:bookmarkStart w:id="510" w:name="findar_summary_heading"/>
-      <w:r>
-        <w:t>관련 경험 및 활용 역량</w:t>
-      </w:r>
-      <w:bookmarkEnd w:id="510"/>
-    </w:p>
-    <w:p>
-      <w:bookmarkStart w:id="511" w:name="findar_summary_line"/>
+      <w:bookmarkStart w:id="110" w:name="findar_summary_heading"/>
       <w:r>
         <w:rPr>
+          <w:rFonts w:ascii="Nanum Gothic" w:hAnsi="Nanum Gothic" w:eastAsia="Nanum Gothic" w:cs="Nanum Gothic"/>
           <w:b/>
-          <w:sz w:val="21"/>
+          <w:color w:val="000000"/>
+          <w:sz w:val="22"/>
         </w:rPr>
-        <w:t xml:space="preserve">관련 경험  </w:t>
+        <w:t>5. 활용 역량 및 참고 자료</w:t>
       </w:r>
-      <w:r>
-        <w:rPr>
-          <w:color w:val="595959"/>
-          <w:sz w:val="21"/>
-        </w:rPr>
-        <w:t>[프로젝트·교육·활동명] / [기간] / [본인 역할과 주요 내용]</w:t>
-      </w:r>
-      <w:bookmarkEnd w:id="511"/>
-      <w:pPr>
-        <w:spacing w:before="0" w:after="80" w:line="280" w:lineRule="auto"/>
-      </w:pPr>
+      <w:bookmarkEnd w:id="110"/>
     </w:p>
-    <w:p>
-      <w:bookmarkStart w:id="512" w:name="findar_summary_skills"/>
-      <w:r>
-        <w:rPr>
-          <w:b/>
-          <w:sz w:val="21"/>
-        </w:rPr>
-        <w:t xml:space="preserve">활용 역량  </w:t>
-      </w:r>
-      <w:r>
-        <w:rPr>
-          <w:color w:val="595959"/>
-          <w:sz w:val="21"/>
-        </w:rPr>
-        <w:t>[직무 관련 지식·도구·언어와 실제 활용 범위]</w:t>
-      </w:r>
-      <w:bookmarkEnd w:id="512"/>
-      <w:pPr>
-        <w:spacing w:before="0" w:after="80" w:line="280" w:lineRule="auto"/>
-      </w:pPr>
-    </w:p>
-    <w:p>
-      <w:bookmarkStart w:id="513" w:name="findar_summary_reference"/>
-      <w:r>
-        <w:rPr>
-          <w:b/>
-          <w:sz w:val="21"/>
-        </w:rPr>
-        <w:t xml:space="preserve">참고 자료  </w:t>
-      </w:r>
-      <w:r>
-        <w:rPr>
-          <w:color w:val="595959"/>
-          <w:sz w:val="21"/>
-        </w:rPr>
-        <w:t>[위 경험을 확인할 수 있는 자료명 또는 링크]</w:t>
-      </w:r>
-      <w:bookmarkEnd w:id="513"/>
-      <w:pPr>
-        <w:spacing w:before="0" w:after="80" w:line="280" w:lineRule="auto"/>
-      </w:pPr>
-    </w:p>
-    <w:p>
-      <w:bookmarkStart w:id="514" w:name="findar_details_break"/>
-      <w:r>
-        <w:br w:type="page"/>
-      </w:r>
-      <w:bookmarkEnd w:id="514"/>
-    </w:p>
+    <w:tbl>
+      <w:tblPr>
+        <w:tblW w:type="dxa" w:w="9865"/>
+        <w:jc w:val="center"/>
+        <w:tblLayout w:type="fixed"/>
+        <w:tblLook w:firstColumn="1" w:firstRow="1" w:lastColumn="0" w:lastRow="0" w:noHBand="0" w:noVBand="1" w:val="04A0"/>
+        <w:tblInd w:w="0" w:type="dxa"/>
+        <w:tblBorders>
+          <w:top w:val="single" w:sz="5" w:color="B9BEC4"/>
+          <w:bottom w:val="single" w:sz="5" w:color="B9BEC4"/>
+          <w:left w:val="single" w:sz="5" w:color="B9BEC4"/>
+          <w:right w:val="single" w:sz="5" w:color="B9BEC4"/>
+          <w:insideH w:val="single" w:sz="5" w:color="B9BEC4"/>
+          <w:insideV w:val="single" w:sz="5" w:color="B9BEC4"/>
+        </w:tblBorders>
+        <w:tblCellMar>
+          <w:top w:w="60" w:type="dxa"/>
+          <w:bottom w:w="60" w:type="dxa"/>
+          <w:left w:w="100" w:type="dxa"/>
+          <w:right w:w="100" w:type="dxa"/>
+        </w:tblCellMar>
+        <w:tblCaption w:val="findar_summary_table"/>
+      </w:tblPr>
+      <w:tblGrid>
+        <w:gridCol w:w="1417"/>
+        <w:gridCol w:w="8447"/>
+      </w:tblGrid>
+      <w:tr>
+        <w:trPr>
+          <w:cantSplit/>
+        </w:trPr>
+        <w:tc>
+          <w:tcPr>
+            <w:tcW w:type="dxa" w:w="1417"/>
+            <w:vAlign w:val="center"/>
+            <w:shd w:fill="F0F1F2" w:val="clear"/>
+          </w:tcPr>
+          <w:p>
+            <w:pPr>
+              <w:keepNext w:val="0"/>
+              <w:spacing w:after="0" w:line="276" w:lineRule="auto"/>
+              <w:snapToGrid w:val="0"/>
+              <w:jc w:val="center"/>
+            </w:pPr>
+            <w:r>
+              <w:rPr>
+                <w:rFonts w:ascii="Nanum Gothic" w:hAnsi="Nanum Gothic" w:eastAsia="Nanum Gothic" w:cs="Nanum Gothic"/>
+                <w:b/>
+                <w:color w:val="000000"/>
+                <w:sz w:val="20"/>
+              </w:rPr>
+              <w:t>활용 역량</w:t>
+            </w:r>
+          </w:p>
+        </w:tc>
+        <w:tc>
+          <w:tcPr>
+            <w:tcW w:type="dxa" w:w="8447"/>
+            <w:vAlign w:val="center"/>
+          </w:tcPr>
+          <w:p>
+            <w:pPr>
+              <w:keepNext w:val="0"/>
+              <w:spacing w:after="0" w:line="276" w:lineRule="auto"/>
+              <w:snapToGrid w:val="0"/>
+              <w:jc w:val="left"/>
+            </w:pPr>
+            <w:r>
+              <w:rPr>
+                <w:rFonts w:ascii="Nanum Gothic" w:hAnsi="Nanum Gothic" w:eastAsia="Nanum Gothic" w:cs="Nanum Gothic"/>
+                <w:b w:val="0"/>
+                <w:color w:val="000000"/>
+                <w:sz w:val="20"/>
+              </w:rPr>
+              <w:t>[활용 가능한 도구 및 실제 활용 범위]</w:t>
+            </w:r>
+          </w:p>
+        </w:tc>
+      </w:tr>
+      <w:tr>
+        <w:trPr>
+          <w:cantSplit/>
+        </w:trPr>
+        <w:tc>
+          <w:tcPr>
+            <w:tcW w:type="dxa" w:w="1417"/>
+            <w:vAlign w:val="center"/>
+            <w:shd w:fill="F0F1F2" w:val="clear"/>
+          </w:tcPr>
+          <w:p>
+            <w:pPr>
+              <w:keepNext w:val="0"/>
+              <w:spacing w:after="0" w:line="276" w:lineRule="auto"/>
+              <w:snapToGrid w:val="0"/>
+              <w:jc w:val="center"/>
+            </w:pPr>
+            <w:r>
+              <w:rPr>
+                <w:rFonts w:ascii="Nanum Gothic" w:hAnsi="Nanum Gothic" w:eastAsia="Nanum Gothic" w:cs="Nanum Gothic"/>
+                <w:b/>
+                <w:color w:val="000000"/>
+                <w:sz w:val="20"/>
+              </w:rPr>
+              <w:t>참고 자료</w:t>
+            </w:r>
+          </w:p>
+        </w:tc>
+        <w:tc>
+          <w:tcPr>
+            <w:tcW w:type="dxa" w:w="8447"/>
+            <w:vAlign w:val="center"/>
+          </w:tcPr>
+          <w:p>
+            <w:pPr>
+              <w:keepNext w:val="0"/>
+              <w:spacing w:after="0" w:line="276" w:lineRule="auto"/>
+              <w:snapToGrid w:val="0"/>
+              <w:jc w:val="left"/>
+            </w:pPr>
+            <w:r>
+              <w:rPr>
+                <w:rFonts w:ascii="Nanum Gothic" w:hAnsi="Nanum Gothic" w:eastAsia="Nanum Gothic" w:cs="Nanum Gothic"/>
+                <w:b w:val="0"/>
+                <w:color w:val="000000"/>
+                <w:sz w:val="20"/>
+              </w:rPr>
+              <w:t>[포트폴리오 또는 확인 자료 링크]</w:t>
+            </w:r>
+          </w:p>
+        </w:tc>
+      </w:tr>
+    </w:tbl>
     <w:p>
       <w:pPr>
         <w:pStyle w:val="Title"/>
-        <w:spacing w:before="0" w:after="120"/>
+        <w:pageBreakBefore/>
       </w:pPr>
-      <w:bookmarkStart w:id="515" w:name="findar_details_title"/>
+      <w:bookmarkStart w:id="112" w:name="findar_details_title"/>
       <w:r>
         <w:rPr>
-          <w:b w:val="0"/>
-          <w:sz w:val="40"/>
+          <w:rFonts w:ascii="Nanum Gothic" w:hAnsi="Nanum Gothic" w:eastAsia="Nanum Gothic" w:cs="Nanum Gothic"/>
+          <w:b/>
+          <w:color w:val="000000"/>
+          <w:sz w:val="36"/>
         </w:rPr>
         <w:t>경력 및 경험 상세</w:t>
       </w:r>
-      <w:bookmarkEnd w:id="515"/>
+      <w:bookmarkEnd w:id="112"/>
     </w:p>
     <w:p>
       <w:pPr>
         <w:pStyle w:val="Subtitle"/>
-        <w:spacing w:before="0" w:after="120" w:line="270" w:lineRule="auto"/>
+        <w:spacing w:after="200"/>
+        <w:jc w:val="center"/>
       </w:pPr>
-      <w:bookmarkStart w:id="516" w:name="findar_details_subtitle"/>
+      <w:bookmarkStart w:id="113" w:name="findar_details_subtitle"/>
       <w:r>
         <w:rPr>
-          <w:sz w:val="21"/>
+          <w:rFonts w:ascii="Nanum Gothic" w:hAnsi="Nanum Gothic" w:eastAsia="Nanum Gothic" w:cs="Nanum Gothic"/>
+          <w:b w:val="0"/>
           <w:color w:val="000000"/>
-          <w:b w:val="0"/>
+          <w:sz w:val="19"/>
         </w:rPr>
-        <w:t>[지원 회사]  [지원 팀 또는 직무]  [성명]</w:t>
+        <w:t>[지원 회사]  |  [지원 팀 또는 직무]  |  [성명]</w:t>
       </w:r>
-      <w:bookmarkEnd w:id="516"/>
+      <w:bookmarkEnd w:id="113"/>
     </w:p>
     <w:p>
       <w:pPr>
         <w:pStyle w:val="Heading1"/>
       </w:pPr>
-      <w:bookmarkStart w:id="517" w:name="findar_details_work_heading"/>
+      <w:bookmarkStart w:id="114" w:name="findar_details_work_heading"/>
       <w:r>
+        <w:rPr>
+          <w:rFonts w:ascii="Nanum Gothic" w:hAnsi="Nanum Gothic" w:eastAsia="Nanum Gothic" w:cs="Nanum Gothic"/>
+          <w:b/>
+          <w:color w:val="000000"/>
+          <w:sz w:val="22"/>
+        </w:rPr>
         <w:t>업무 경험</w:t>
       </w:r>
-      <w:bookmarkEnd w:id="517"/>
+      <w:bookmarkEnd w:id="114"/>
     </w:p>
     <w:p>
       <w:pPr>
-        <w:spacing w:before="120" w:after="80"/>
+        <w:pStyle w:val="Heading2"/>
       </w:pPr>
-      <w:bookmarkStart w:id="518" w:name="findar_details_work_title"/>
+      <w:bookmarkStart w:id="115" w:name="findar_details_work_title"/>
       <w:r>
         <w:rPr>
+          <w:rFonts w:ascii="Nanum Gothic" w:hAnsi="Nanum Gothic" w:eastAsia="Nanum Gothic" w:cs="Nanum Gothic"/>
           <w:b/>
+          <w:color w:val="000000"/>
+          <w:sz w:val="21"/>
         </w:rPr>
-        <w:t>[회사명]  [부서 및 직위]</w:t>
+        <w:t>[회사명 / 부서 및 직위]</w:t>
       </w:r>
-      <w:bookmarkEnd w:id="518"/>
+      <w:bookmarkEnd w:id="115"/>
     </w:p>
     <w:p>
       <w:pPr>
-        <w:spacing w:before="0" w:after="80"/>
+        <w:spacing w:after="120"/>
       </w:pPr>
-      <w:bookmarkStart w:id="519" w:name="findar_details_meta"/>
+      <w:bookmarkStart w:id="116" w:name="findar_details_meta"/>
       <w:r>
         <w:rPr>
+          <w:rFonts w:ascii="Nanum Gothic" w:hAnsi="Nanum Gothic" w:eastAsia="Nanum Gothic" w:cs="Nanum Gothic"/>
           <w:b w:val="0"/>
-          <w:color w:val="595959"/>
-          <w:sz w:val="20"/>
+          <w:color w:val="000000"/>
+          <w:sz w:val="19"/>
         </w:rPr>
-        <w:t>[YYYY.MM - YYYY.MM 또는 현재]  |  [고용 형태]</w:t>
+        <w:t>[재직 기간 / 고용 형태]</w:t>
       </w:r>
-      <w:bookmarkEnd w:id="519"/>
+      <w:bookmarkEnd w:id="116"/>
     </w:p>
     <w:p>
-      <w:bookmarkStart w:id="520" w:name="findar_details_work_line"/>
+      <w:pPr/>
+      <w:bookmarkStart w:id="117" w:name="findar_details_work_line"/>
       <w:r>
         <w:rPr>
+          <w:rFonts w:ascii="Nanum Gothic" w:hAnsi="Nanum Gothic" w:eastAsia="Nanum Gothic" w:cs="Nanum Gothic"/>
           <w:b/>
+          <w:color w:val="000000"/>
+          <w:sz w:val="21"/>
         </w:rPr>
         <w:t xml:space="preserve">담당 업무  </w:t>
       </w:r>
       <w:r>
         <w:rPr>
-          <w:color w:val="595959"/>
+          <w:rFonts w:ascii="Nanum Gothic" w:hAnsi="Nanum Gothic" w:eastAsia="Nanum Gothic" w:cs="Nanum Gothic"/>
+          <w:b w:val="0"/>
+          <w:color w:val="000000"/>
+          <w:sz w:val="21"/>
         </w:rPr>
-        <w:t>[직접 맡았던 업무의 범위와 책임을 작성합니다.]</w:t>
+        <w:t>[직접 맡은 업무 범위와 실제 수행한 내용을 작성해주세요.]</w:t>
       </w:r>
-      <w:bookmarkEnd w:id="520"/>
+      <w:bookmarkEnd w:id="117"/>
     </w:p>
     <w:p>
-      <w:bookmarkStart w:id="521" w:name="findar_details_work_challenge"/>
+      <w:pPr/>
+      <w:bookmarkStart w:id="118" w:name="findar_details_work_contribution"/>
       <w:r>
         <w:rPr>
+          <w:rFonts w:ascii="Nanum Gothic" w:hAnsi="Nanum Gothic" w:eastAsia="Nanum Gothic" w:cs="Nanum Gothic"/>
           <w:b/>
+          <w:color w:val="000000"/>
+          <w:sz w:val="21"/>
         </w:rPr>
-        <w:t xml:space="preserve">주요 과제  </w:t>
+        <w:t xml:space="preserve">본인 기여 및 결과  </w:t>
       </w:r>
       <w:r>
         <w:rPr>
-          <w:color w:val="595959"/>
+          <w:rFonts w:ascii="Nanum Gothic" w:hAnsi="Nanum Gothic" w:eastAsia="Nanum Gothic" w:cs="Nanum Gothic"/>
+          <w:b w:val="0"/>
+          <w:color w:val="000000"/>
+          <w:sz w:val="21"/>
         </w:rPr>
-        <w:t>[해결해야 했던 문제와 당시의 제약을 작성합니다.]</w:t>
+        <w:t>[본인이 판단하고 실행한 내용과 확인 가능한 결과를 작성해주세요.]</w:t>
       </w:r>
-      <w:bookmarkEnd w:id="521"/>
-    </w:p>
-    <w:p>
-      <w:bookmarkStart w:id="522" w:name="findar_details_work_contribution"/>
-      <w:r>
-        <w:rPr>
-          <w:b/>
-        </w:rPr>
-        <w:t xml:space="preserve">본인 기여  </w:t>
-      </w:r>
-      <w:r>
-        <w:rPr>
-          <w:color w:val="595959"/>
-        </w:rPr>
-        <w:t>[본인이 판단하고 실행한 내용을 구체적으로 작성합니다.]</w:t>
-      </w:r>
-      <w:bookmarkEnd w:id="522"/>
-    </w:p>
-    <w:p>
-      <w:bookmarkStart w:id="523" w:name="findar_details_work_result"/>
-      <w:r>
-        <w:rPr>
-          <w:b/>
-        </w:rPr>
-        <w:t xml:space="preserve">결과 및 근거  </w:t>
-      </w:r>
-      <w:r>
-        <w:rPr>
-          <w:color w:val="595959"/>
-        </w:rPr>
-        <w:t>[확인 가능한 결과를 작성합니다. 수치는 기간과 측정 기준을 함께 적습니다.]</w:t>
-      </w:r>
-      <w:bookmarkEnd w:id="523"/>
-    </w:p>
-    <w:p>
-      <w:bookmarkStart w:id="524" w:name="findar_details_work_relevance"/>
-      <w:r>
-        <w:rPr>
-          <w:b/>
-        </w:rPr>
-        <w:t xml:space="preserve">직무 관련성  </w:t>
-      </w:r>
-      <w:r>
-        <w:rPr>
-          <w:color w:val="595959"/>
-        </w:rPr>
-        <w:t>[이 경험에서 설명할 수 있는 역량과 지원 업무에 활용할 부분을 작성합니다.]</w:t>
-      </w:r>
-      <w:bookmarkEnd w:id="524"/>
+      <w:bookmarkEnd w:id="118"/>
     </w:p>
     <w:p>
       <w:pPr>
         <w:pStyle w:val="Heading1"/>
       </w:pPr>
-      <w:bookmarkStart w:id="525" w:name="findar_details_project_heading"/>
+      <w:bookmarkStart w:id="119" w:name="findar_details_project_heading"/>
       <w:r>
+        <w:rPr>
+          <w:rFonts w:ascii="Nanum Gothic" w:hAnsi="Nanum Gothic" w:eastAsia="Nanum Gothic" w:cs="Nanum Gothic"/>
+          <w:b/>
+          <w:color w:val="000000"/>
+          <w:sz w:val="22"/>
+        </w:rPr>
         <w:t>프로젝트 및 학습 경험</w:t>
       </w:r>
-      <w:bookmarkEnd w:id="525"/>
+      <w:bookmarkEnd w:id="119"/>
     </w:p>
     <w:p>
       <w:pPr>
-        <w:spacing w:before="120" w:after="80"/>
+        <w:pStyle w:val="Heading2"/>
       </w:pPr>
-      <w:bookmarkStart w:id="526" w:name="findar_details_project_title"/>
+      <w:bookmarkStart w:id="120" w:name="findar_details_project_title"/>
       <w:r>
         <w:rPr>
+          <w:rFonts w:ascii="Nanum Gothic" w:hAnsi="Nanum Gothic" w:eastAsia="Nanum Gothic" w:cs="Nanum Gothic"/>
           <w:b/>
+          <w:color w:val="000000"/>
+          <w:sz w:val="21"/>
         </w:rPr>
-        <w:t>[프로젝트명 또는 교육 및 연구 주제]</w:t>
+        <w:t>[프로젝트 또는 활동명]</w:t>
       </w:r>
-      <w:bookmarkEnd w:id="526"/>
+      <w:bookmarkEnd w:id="120"/>
     </w:p>
     <w:p>
       <w:pPr>
-        <w:spacing w:before="0" w:after="80"/>
+        <w:spacing w:after="120"/>
       </w:pPr>
-      <w:bookmarkStart w:id="527" w:name="findar_details_project_meta"/>
+      <w:bookmarkStart w:id="121" w:name="findar_details_project_meta"/>
       <w:r>
         <w:rPr>
+          <w:rFonts w:ascii="Nanum Gothic" w:hAnsi="Nanum Gothic" w:eastAsia="Nanum Gothic" w:cs="Nanum Gothic"/>
           <w:b w:val="0"/>
-          <w:color w:val="595959"/>
-          <w:sz w:val="20"/>
+          <w:color w:val="000000"/>
+          <w:sz w:val="19"/>
         </w:rPr>
-        <w:t>[YYYY.MM - YYYY.MM]  |  [개인 프로젝트·팀 프로젝트·교육 등 실제 구분]</w:t>
+        <w:t>[기간 / 실제 경험 구분]</w:t>
       </w:r>
-      <w:bookmarkEnd w:id="527"/>
+      <w:bookmarkEnd w:id="121"/>
     </w:p>
     <w:p>
-      <w:bookmarkStart w:id="528" w:name="findar_details_project_scope"/>
+      <w:pPr/>
+      <w:bookmarkStart w:id="122" w:name="findar_details_project_line"/>
       <w:r>
         <w:rPr>
+          <w:rFonts w:ascii="Nanum Gothic" w:hAnsi="Nanum Gothic" w:eastAsia="Nanum Gothic" w:cs="Nanum Gothic"/>
           <w:b/>
+          <w:color w:val="000000"/>
+          <w:sz w:val="21"/>
         </w:rPr>
-        <w:t xml:space="preserve">목적 및 범위  </w:t>
+        <w:t xml:space="preserve">역할 및 내용  </w:t>
       </w:r>
       <w:r>
         <w:rPr>
-          <w:color w:val="595959"/>
+          <w:rFonts w:ascii="Nanum Gothic" w:hAnsi="Nanum Gothic" w:eastAsia="Nanum Gothic" w:cs="Nanum Gothic"/>
+          <w:b w:val="0"/>
+          <w:color w:val="000000"/>
+          <w:sz w:val="21"/>
         </w:rPr>
-        <w:t>[수행 목적, 다룬 주제, 사용한 자료나 도구를 작성합니다.]</w:t>
+        <w:t>[본인이 수행한 범위와 실제 과정을 작성해주세요.]</w:t>
       </w:r>
-      <w:bookmarkEnd w:id="528"/>
+      <w:bookmarkEnd w:id="122"/>
     </w:p>
     <w:p>
-      <w:bookmarkStart w:id="529" w:name="findar_details_project_role"/>
+      <w:pPr/>
+      <w:bookmarkStart w:id="123" w:name="findar_details_project_result"/>
       <w:r>
         <w:rPr>
+          <w:rFonts w:ascii="Nanum Gothic" w:hAnsi="Nanum Gothic" w:eastAsia="Nanum Gothic" w:cs="Nanum Gothic"/>
           <w:b/>
-        </w:rPr>
-        <w:t xml:space="preserve">본인 역할  </w:t>
-      </w:r>
-      <w:r>
-        <w:rPr>
-          <w:color w:val="595959"/>
-        </w:rPr>
-        <w:t>[개인 작업의 범위 또는 팀에서 맡은 역할을 작성합니다.]</w:t>
-      </w:r>
-      <w:bookmarkEnd w:id="529"/>
-    </w:p>
-    <w:p>
-      <w:bookmarkStart w:id="530" w:name="findar_details_project_line"/>
-      <w:r>
-        <w:rPr>
-          <w:b/>
-        </w:rPr>
-        <w:t xml:space="preserve">수행 내용  </w:t>
-      </w:r>
-      <w:r>
-        <w:rPr>
-          <w:color w:val="595959"/>
-        </w:rPr>
-        <w:t>[분석·구현·검증 등 실제 수행한 절차를 작성합니다.]</w:t>
-      </w:r>
-      <w:bookmarkEnd w:id="530"/>
-    </w:p>
-    <w:p>
-      <w:bookmarkStart w:id="531" w:name="findar_details_project_result"/>
-      <w:r>
-        <w:rPr>
-          <w:b/>
+          <w:color w:val="000000"/>
+          <w:sz w:val="21"/>
         </w:rPr>
         <w:t xml:space="preserve">결과 및 한계  </w:t>
       </w:r>
       <w:r>
         <w:rPr>
-          <w:color w:val="595959"/>
+          <w:rFonts w:ascii="Nanum Gothic" w:hAnsi="Nanum Gothic" w:eastAsia="Nanum Gothic" w:cs="Nanum Gothic"/>
+          <w:b w:val="0"/>
+          <w:color w:val="000000"/>
+          <w:sz w:val="21"/>
         </w:rPr>
-        <w:t>[산출물과 확인한 결과, 자료나 방법의 한계를 작성합니다.]</w:t>
+        <w:t>[확인한 결과와 한계를 작성해주세요.]</w:t>
       </w:r>
-      <w:bookmarkEnd w:id="531"/>
-    </w:p>
-    <w:p>
-      <w:bookmarkStart w:id="532" w:name="findar_details_project_reference"/>
-      <w:r>
-        <w:rPr>
-          <w:b/>
-        </w:rPr>
-        <w:t xml:space="preserve">확인 자료  </w:t>
-      </w:r>
-      <w:r>
-        <w:rPr>
-          <w:color w:val="595959"/>
-        </w:rPr>
-        <w:t>[공개 가능한 보고서·코드·발표 자료 등의 제목 또는 링크]</w:t>
-      </w:r>
-      <w:bookmarkEnd w:id="532"/>
-    </w:p>
-    <w:p>
-      <w:bookmarkStart w:id="533" w:name="findar_essay_break"/>
-      <w:r>
-        <w:br w:type="page"/>
-      </w:r>
-      <w:bookmarkEnd w:id="533"/>
+      <w:bookmarkEnd w:id="123"/>
     </w:p>
     <w:p>
       <w:pPr>
         <w:pStyle w:val="Title"/>
-        <w:spacing w:before="0" w:after="120"/>
+        <w:pageBreakBefore/>
       </w:pPr>
-      <w:bookmarkStart w:id="534" w:name="findar_essay_title"/>
+      <w:bookmarkStart w:id="124" w:name="findar_essay_title"/>
       <w:r>
         <w:rPr>
-          <w:b w:val="0"/>
-          <w:sz w:val="40"/>
+          <w:rFonts w:ascii="Nanum Gothic" w:hAnsi="Nanum Gothic" w:eastAsia="Nanum Gothic" w:cs="Nanum Gothic"/>
+          <w:b/>
+          <w:color w:val="000000"/>
+          <w:sz w:val="36"/>
         </w:rPr>
         <w:t>자기소개서</w:t>
       </w:r>
-      <w:bookmarkEnd w:id="534"/>
+      <w:bookmarkEnd w:id="124"/>
     </w:p>
     <w:p>
       <w:pPr>
         <w:pStyle w:val="Subtitle"/>
-        <w:spacing w:before="0" w:after="120" w:line="270" w:lineRule="auto"/>
+        <w:spacing w:after="280"/>
+        <w:jc w:val="center"/>
       </w:pPr>
-      <w:bookmarkStart w:id="535" w:name="findar_essay_identity"/>
+      <w:bookmarkStart w:id="125" w:name="findar_essay_identity"/>
       <w:r>
         <w:rPr>
-          <w:sz w:val="21"/>
+          <w:rFonts w:ascii="Nanum Gothic" w:hAnsi="Nanum Gothic" w:eastAsia="Nanum Gothic" w:cs="Nanum Gothic"/>
+          <w:b w:val="0"/>
           <w:color w:val="000000"/>
-          <w:b w:val="0"/>
+          <w:sz w:val="19"/>
         </w:rPr>
-        <w:t>[지원 회사]  [지원 팀 또는 직무]  [성명]</w:t>
+        <w:t>[지원 회사]  |  [지원 팀 또는 직무]  |  [성명]</w:t>
       </w:r>
-      <w:bookmarkEnd w:id="535"/>
+      <w:bookmarkEnd w:id="125"/>
     </w:p>
     <w:p>
       <w:pPr>
         <w:pStyle w:val="Heading1"/>
+        <w:shd w:val="clear" w:fill="F0F1F2"/>
+        <w:spacing w:before="240" w:after="160"/>
       </w:pPr>
-      <w:bookmarkStart w:id="536" w:name="findar_essay_question"/>
+      <w:bookmarkStart w:id="126" w:name="findar_essay_question"/>
       <w:r>
+        <w:rPr>
+          <w:rFonts w:ascii="Nanum Gothic" w:hAnsi="Nanum Gothic" w:eastAsia="Nanum Gothic" w:cs="Nanum Gothic"/>
+          <w:b/>
+          <w:color w:val="000000"/>
+          <w:sz w:val="22"/>
+        </w:rPr>
         <w:t>지원동기</w:t>
       </w:r>
-      <w:bookmarkEnd w:id="536"/>
+      <w:bookmarkEnd w:id="126"/>
     </w:p>
     <w:p>
       <w:pPr>
-        <w:spacing w:before="0" w:after="200"/>
+        <w:spacing w:after="1600" w:line="348" w:lineRule="auto"/>
       </w:pPr>
-      <w:bookmarkStart w:id="537" w:name="findar_essay_body"/>
+      <w:bookmarkStart w:id="127" w:name="findar_essay_body"/>
       <w:r>
         <w:rPr>
+          <w:rFonts w:ascii="Nanum Gothic" w:hAnsi="Nanum Gothic" w:eastAsia="Nanum Gothic" w:cs="Nanum Gothic"/>
           <w:b w:val="0"/>
-          <w:color w:val="595959"/>
+          <w:color w:val="72777D"/>
+          <w:sz w:val="22"/>
         </w:rPr>
-        <w:t>[이 직무에 지원하게 된 계기와 실제 준비 과정을 작성합니다. 관심을 갖게 된 이유를 구체적인 경험이나 행동으로 설명합니다.]</w:t>
+        <w:t>[해당 회사와 직무에 지원한 이유, 실제 준비한 과정을 작성해주세요.]</w:t>
       </w:r>
-      <w:bookmarkEnd w:id="537"/>
-    </w:p>
-    <w:p>
-      <w:pPr>
-        <w:spacing w:before="0" w:after="680"/>
-      </w:pPr>
-      <w:bookmarkStart w:id="538" w:name="findar_essay_body_end"/>
-      <w:r>
-        <w:rPr>
-          <w:b w:val="0"/>
-          <w:color w:val="595959"/>
-        </w:rPr>
-        <w:t>[해당 회사를 선택한 근거를 확인된 정보에 바탕을 두고 작성합니다. 공고에 제시된 업무 중 어떤 일에 기여하고 싶은지 연결합니다.]</w:t>
-      </w:r>
-      <w:bookmarkEnd w:id="538"/>
+      <w:bookmarkEnd w:id="127"/>
     </w:p>
     <w:p>
       <w:pPr>
         <w:pStyle w:val="Heading1"/>
+        <w:shd w:val="clear" w:fill="F0F1F2"/>
+        <w:spacing w:before="240" w:after="160"/>
       </w:pPr>
-      <w:bookmarkStart w:id="539" w:name="findar_essay_question_second"/>
+      <w:bookmarkStart w:id="128" w:name="findar_essay_question_2"/>
       <w:r>
+        <w:rPr>
+          <w:rFonts w:ascii="Nanum Gothic" w:hAnsi="Nanum Gothic" w:eastAsia="Nanum Gothic" w:cs="Nanum Gothic"/>
+          <w:b/>
+          <w:color w:val="000000"/>
+          <w:sz w:val="22"/>
+        </w:rPr>
         <w:t>직무 관련 역량</w:t>
       </w:r>
-      <w:bookmarkEnd w:id="539"/>
+      <w:bookmarkEnd w:id="128"/>
     </w:p>
     <w:p>
       <w:pPr>
-        <w:spacing w:before="0" w:after="200"/>
+        <w:spacing w:after="1600" w:line="348" w:lineRule="auto"/>
       </w:pPr>
-      <w:bookmarkStart w:id="540" w:name="findar_essay_body_second"/>
+      <w:bookmarkStart w:id="129" w:name="findar_essay_body_2"/>
       <w:r>
         <w:rPr>
+          <w:rFonts w:ascii="Nanum Gothic" w:hAnsi="Nanum Gothic" w:eastAsia="Nanum Gothic" w:cs="Nanum Gothic"/>
           <w:b w:val="0"/>
-          <w:color w:val="595959"/>
+          <w:color w:val="72777D"/>
+          <w:sz w:val="22"/>
         </w:rPr>
-        <w:t>[지원 업무에 필요한 역량을 보여주는 경험을 고릅니다. 상황과 목표, 맡은 역할을 간결하게 밝힌 뒤 본인이 한 행동을 중심으로 작성합니다.]</w:t>
+        <w:t>[지원 업무와 관련된 경험에서 본인이 수행한 내용과 결과를 작성해주세요.]</w:t>
       </w:r>
-      <w:bookmarkEnd w:id="540"/>
-    </w:p>
-    <w:p>
-      <w:pPr>
-        <w:spacing w:before="0" w:after="680"/>
-      </w:pPr>
-      <w:bookmarkStart w:id="541" w:name="findar_essay_body_second_end"/>
-      <w:r>
-        <w:rPr>
-          <w:b w:val="0"/>
-          <w:color w:val="595959"/>
-        </w:rPr>
-        <w:t>[결과와 이를 뒷받침할 근거를 작성합니다. 경험의 범위 안에서 설명할 수 있는 역량과, 지원 업무에 어떻게 활용할 수 있는지 정리합니다.]</w:t>
-      </w:r>
-      <w:bookmarkEnd w:id="541"/>
+      <w:bookmarkEnd w:id="129"/>
     </w:p>
     <w:p>
       <w:pPr>
         <w:pStyle w:val="Heading1"/>
+        <w:shd w:val="clear" w:fill="F0F1F2"/>
+        <w:spacing w:before="240" w:after="160"/>
       </w:pPr>
-      <w:bookmarkStart w:id="542" w:name="findar_essay_question_third"/>
+      <w:bookmarkStart w:id="130" w:name="findar_essay_question_3"/>
       <w:r>
+        <w:rPr>
+          <w:rFonts w:ascii="Nanum Gothic" w:hAnsi="Nanum Gothic" w:eastAsia="Nanum Gothic" w:cs="Nanum Gothic"/>
+          <w:b/>
+          <w:color w:val="000000"/>
+          <w:sz w:val="22"/>
+        </w:rPr>
         <w:t>일하는 방식</w:t>
       </w:r>
-      <w:bookmarkEnd w:id="542"/>
+      <w:bookmarkEnd w:id="130"/>
     </w:p>
     <w:p>
       <w:pPr>
-        <w:spacing w:before="0" w:after="200"/>
+        <w:spacing w:after="1600" w:line="348" w:lineRule="auto"/>
       </w:pPr>
-      <w:bookmarkStart w:id="543" w:name="findar_essay_body_third"/>
+      <w:bookmarkStart w:id="131" w:name="findar_essay_body_3"/>
       <w:r>
         <w:rPr>
+          <w:rFonts w:ascii="Nanum Gothic" w:hAnsi="Nanum Gothic" w:eastAsia="Nanum Gothic" w:cs="Nanum Gothic"/>
           <w:b w:val="0"/>
-          <w:color w:val="595959"/>
+          <w:color w:val="72777D"/>
+          <w:sz w:val="22"/>
         </w:rPr>
-        <w:t>[문제 해결·검증·협업 중 자신을 잘 보여주는 사례를 작성합니다. 앞의 사례와 겹치면 다른 행동이나 판단을 보여줄 수 있는 경험을 선택합니다.]</w:t>
+        <w:t>[문제 해결, 검증 또는 협업에서 본인의 행동을 보여주는 경험을 작성해주세요.]</w:t>
       </w:r>
-      <w:bookmarkEnd w:id="543"/>
-    </w:p>
-    <w:p>
-      <w:pPr>
-        <w:spacing w:before="0" w:after="120"/>
-      </w:pPr>
-      <w:bookmarkStart w:id="544" w:name="findar_essay_body_third_end"/>
-      <w:r>
-        <w:rPr>
-          <w:b w:val="0"/>
-          <w:color w:val="595959"/>
-        </w:rPr>
-        <w:t>[판단한 이유, 실행 과정, 결과를 작성하고 업무를 수행할 때 적용할 방식을 설명합니다. 공고가 다른 내용을 요구하면 이 소제목과 본문을 바꿉니다.]</w:t>
-      </w:r>
-      <w:bookmarkEnd w:id="544"/>
+      <w:bookmarkEnd w:id="131"/>
     </w:p>
     <w:sectPr>
       <w:headerReference w:type="default" r:id="rId9"/>
       <w:footerReference w:type="default" r:id="rId10"/>
-      <w:pgSz w:w="12240" w:h="15840"/>
-      <w:pgMar w:top="907" w:right="1037" w:bottom="864" w:left="1037" w:header="403" w:footer="403" w:gutter="0"/>
+      <w:pgSz w:w="11906" w:h="16838"/>
+      <w:pgMar w:top="964" w:right="1020" w:bottom="964" w:left="1020" w:header="454" w:footer="454" w:gutter="0"/>
       <w:cols w:space="720"/>
       <w:docGrid w:linePitch="360"/>
     </w:sectPr>
@@ -1561,6 +1835,12 @@
       <w:jc w:val="right"/>
     </w:pPr>
     <w:r>
+      <w:rPr>
+        <w:rFonts w:ascii="Nanum Gothic" w:hAnsi="Nanum Gothic" w:eastAsia="Nanum Gothic" w:cs="Nanum Gothic"/>
+        <w:b w:val="0"/>
+        <w:color w:val="000000"/>
+        <w:sz w:val="16"/>
+      </w:rPr>
       <w:t xml:space="preserve">[성명]  |  </w:t>
     </w:r>
     <w:fldSimple w:instr="PAGE"/>
@@ -1570,18 +1850,7 @@
 
 <file path=word/header1.xml><?xml version="1.0" encoding="utf-8"?>
 <w:hdr xmlns:m="http://schemas.openxmlformats.org/officeDocument/2006/math" xmlns:mc="http://schemas.openxmlformats.org/markup-compatibility/2006" xmlns:mo="http://schemas.microsoft.com/office/mac/office/2008/main" xmlns:mv="urn:schemas-microsoft-com:mac:vml" xmlns:o="urn:schemas-microsoft-com:office:office" xmlns:r="http://schemas.openxmlformats.org/officeDocument/2006/relationships" xmlns:v="urn:schemas-microsoft-com:vml" xmlns:w10="urn:schemas-microsoft-com:office:word" xmlns:w14="http://schemas.microsoft.com/office/word/2010/wordml" xmlns:w="http://schemas.openxmlformats.org/wordprocessingml/2006/main" xmlns:wne="http://schemas.microsoft.com/office/word/2006/wordml" xmlns:wp14="http://schemas.microsoft.com/office/word/2010/wordprocessingDrawing" xmlns:wp="http://schemas.openxmlformats.org/drawingml/2006/wordprocessingDrawing" xmlns:wpc="http://schemas.microsoft.com/office/word/2010/wordprocessingCanvas" xmlns:wpg="http://schemas.microsoft.com/office/word/2010/wordprocessingGroup" xmlns:wpi="http://schemas.microsoft.com/office/word/2010/wordprocessingInk" xmlns:wps="http://schemas.microsoft.com/office/word/2010/wordprocessingShape" mc:Ignorable="w14 wp14">
-  <w:p>
-    <w:pPr>
-      <w:pStyle w:val="Header"/>
-      <w:spacing w:after="0"/>
-    </w:pPr>
-    <w:r>
-      <w:rPr>
-        <w:color w:val="000000"/>
-      </w:rPr>
-      <w:t>[지원 회사]  /  [지원 직무]</w:t>
-    </w:r>
-  </w:p>
+  <w:p/>
 </w:hdr>
 </file>
 
@@ -1949,15 +2218,16 @@
     <w:qFormat/>
     <w:rsid w:val="00FC693F"/>
     <w:pPr>
-      <w:spacing w:after="100" w:line="300" w:lineRule="auto"/>
+      <w:widowControl/>
       <w:snapToGrid w:val="0"/>
+      <w:spacing w:before="0" w:after="80" w:line="288" w:lineRule="auto"/>
     </w:pPr>
     <w:rPr>
       <w:rFonts w:ascii="Nanum Gothic" w:hAnsi="Nanum Gothic" w:eastAsia="Nanum Gothic" w:cs="Nanum Gothic"/>
       <w:b w:val="0"/>
       <w:i w:val="0"/>
       <w:color w:val="000000"/>
-      <w:sz w:val="22"/>
+      <w:sz w:val="21"/>
     </w:rPr>
   </w:style>
   <w:style w:type="paragraph" w:styleId="Header">
@@ -1968,19 +2238,16 @@
     <w:unhideWhenUsed/>
     <w:rsid w:val="00E618BF"/>
     <w:pPr>
-      <w:tabs>
-        <w:tab w:val="center" w:pos="4680"/>
-        <w:tab w:val="right" w:pos="9360"/>
-      </w:tabs>
-      <w:spacing w:after="0" w:line="240" w:lineRule="auto"/>
+      <w:widowControl/>
       <w:snapToGrid w:val="0"/>
+      <w:spacing w:before="0" w:after="80" w:line="288" w:lineRule="auto"/>
     </w:pPr>
     <w:rPr>
       <w:rFonts w:ascii="Nanum Gothic" w:hAnsi="Nanum Gothic" w:eastAsia="Nanum Gothic" w:cs="Nanum Gothic"/>
       <w:b w:val="0"/>
       <w:i w:val="0"/>
       <w:color w:val="000000"/>
-      <w:sz w:val="18"/>
+      <w:sz w:val="16"/>
     </w:rPr>
   </w:style>
   <w:style w:type="character" w:customStyle="1" w:styleId="HeaderChar">
@@ -1998,19 +2265,16 @@
     <w:unhideWhenUsed/>
     <w:rsid w:val="00E618BF"/>
     <w:pPr>
-      <w:tabs>
-        <w:tab w:val="center" w:pos="4680"/>
-        <w:tab w:val="right" w:pos="9360"/>
-      </w:tabs>
-      <w:spacing w:after="0" w:line="240" w:lineRule="auto"/>
+      <w:widowControl/>
       <w:snapToGrid w:val="0"/>
+      <w:spacing w:before="0" w:after="80" w:line="288" w:lineRule="auto"/>
     </w:pPr>
     <w:rPr>
       <w:rFonts w:ascii="Nanum Gothic" w:hAnsi="Nanum Gothic" w:eastAsia="Nanum Gothic" w:cs="Nanum Gothic"/>
       <w:b w:val="0"/>
       <w:i w:val="0"/>
       <w:color w:val="000000"/>
-      <w:sz w:val="18"/>
+      <w:sz w:val="16"/>
     </w:rPr>
   </w:style>
   <w:style w:type="character" w:customStyle="1" w:styleId="FooterChar">
@@ -2030,10 +2294,9 @@
     <w:rsid w:val="00FC693F"/>
     <w:pPr>
       <w:keepNext/>
-      <w:keepLines/>
-      <w:spacing w:before="240" w:after="120" w:line="280" w:lineRule="auto"/>
-      <w:outlineLvl w:val="0"/>
+      <w:widowControl/>
       <w:snapToGrid w:val="0"/>
+      <w:spacing w:before="160" w:after="80" w:line="288" w:lineRule="auto"/>
     </w:pPr>
     <w:rPr>
       <w:rFonts w:cstheme="majorBidi" w:ascii="Nanum Gothic" w:hAnsi="Nanum Gothic" w:eastAsia="Nanum Gothic" w:cs="Nanum Gothic"/>
@@ -2041,7 +2304,7 @@
       <w:bCs/>
       <w:i w:val="0"/>
       <w:color w:val="000000"/>
-      <w:sz w:val="26"/>
+      <w:sz w:val="22"/>
       <w:szCs w:val="28"/>
     </w:rPr>
   </w:style>
@@ -2056,10 +2319,9 @@
     <w:rsid w:val="00FC693F"/>
     <w:pPr>
       <w:keepNext/>
-      <w:keepLines/>
-      <w:spacing w:before="160" w:after="100"/>
-      <w:outlineLvl w:val="1"/>
+      <w:widowControl/>
       <w:snapToGrid w:val="0"/>
+      <w:spacing w:before="140" w:after="80" w:line="288" w:lineRule="auto"/>
     </w:pPr>
     <w:rPr>
       <w:rFonts w:cstheme="majorBidi" w:ascii="Nanum Gothic" w:hAnsi="Nanum Gothic" w:eastAsia="Nanum Gothic" w:cs="Nanum Gothic"/>
@@ -2067,7 +2329,7 @@
       <w:bCs/>
       <w:i w:val="0"/>
       <w:color w:val="000000"/>
-      <w:sz w:val="22"/>
+      <w:sz w:val="21"/>
       <w:szCs w:val="26"/>
     </w:rPr>
   </w:style>
@@ -2322,9 +2584,10 @@
     <w:rsid w:val="00FC693F"/>
     <w:pPr>
       <w:keepNext/>
-      <w:spacing w:after="160" w:line="240" w:lineRule="auto"/>
-      <w:contextualSpacing/>
+      <w:widowControl/>
       <w:snapToGrid w:val="0"/>
+      <w:spacing w:before="0" w:after="240" w:line="288" w:lineRule="auto"/>
+      <w:jc w:val="center"/>
     </w:pPr>
     <w:rPr>
       <w:rFonts w:cstheme="majorBidi" w:ascii="Nanum Gothic" w:hAnsi="Nanum Gothic" w:eastAsia="Nanum Gothic" w:cs="Nanum Gothic"/>
@@ -2333,7 +2596,7 @@
       <w:color w:val="000000"/>
       <w:spacing w:val="5"/>
       <w:kern w:val="28"/>
-      <w:sz w:val="48"/>
+      <w:sz w:val="40"/>
       <w:szCs w:val="52"/>
     </w:rPr>
   </w:style>
@@ -2361,10 +2624,9 @@
     <w:qFormat/>
     <w:rsid w:val="00FC693F"/>
     <w:pPr>
-      <w:numPr>
-        <w:ilvl w:val="1"/>
-      </w:numPr>
+      <w:widowControl/>
       <w:snapToGrid w:val="0"/>
+      <w:spacing w:before="0" w:after="80" w:line="288" w:lineRule="auto"/>
     </w:pPr>
     <w:rPr>
       <w:rFonts w:cstheme="majorBidi" w:ascii="Nanum Gothic" w:hAnsi="Nanum Gothic" w:eastAsia="Nanum Gothic" w:cs="Nanum Gothic"/>
@@ -2373,7 +2635,7 @@
       <w:iCs/>
       <w:color w:val="000000"/>
       <w:spacing w:val="15"/>
-      <w:sz w:val="22"/>
+      <w:sz w:val="19"/>
       <w:szCs w:val="24"/>
     </w:rPr>
   </w:style>

</xml_diff>